<commit_message>
Update UI, bug fix, add data
</commit_message>
<xml_diff>
--- a/Basic Information/Po-Ko Project.docx
+++ b/Basic Information/Po-Ko Project.docx
@@ -65,21 +65,7 @@
         <w:rPr>
           <w:rFonts w:ascii="Arial" w:hAnsi="Arial" w:cs="Arial"/>
         </w:rPr>
-        <w:t xml:space="preserve">Po-Ko is an AI-powered developer capacity framework designed to prevent severe fatigue and the human biological interruptions that disrupt the software engineering workflow. Operating as a proactive daily caretaker via IBM Bob 2.0, Po-Ko continuously </w:t>
-      </w:r>
-      <w:proofErr w:type="spellStart"/>
-      <w:r>
-        <w:rPr>
-          <w:rFonts w:ascii="Arial" w:hAnsi="Arial" w:cs="Arial"/>
-        </w:rPr>
-        <w:t>analyzes</w:t>
-      </w:r>
-      <w:proofErr w:type="spellEnd"/>
-      <w:r>
-        <w:rPr>
-          <w:rFonts w:ascii="Arial" w:hAnsi="Arial" w:cs="Arial"/>
-        </w:rPr>
-        <w:t xml:space="preserve"> local biometric telemetry to deliver frequent, non-intrusive alerts, helping developers provide their bodies with exactly what is required to maintain optimal cognitive function. When severe illness occurs, the system enters an "Active Support State," safely re-routing heavy workloads and flagging code for future bug traceability.</w:t>
+        <w:t>Po-Ko is an AI-powered developer capacity framework designed to prevent severe fatigue and the human biological interruptions that disrupt the software engineering workflow. Operating as a proactive daily caretaker via IBM Bob 2.0, Po-Ko continuously analyzes local biometric telemetry to deliver frequent, non-intrusive alerts, helping developers provide their bodies with exactly what is required to maintain optimal cognitive function. When severe illness occurs, the system enters an "Active Support State," safely re-routing heavy workloads and flagging code for future bug traceability.</w:t>
       </w:r>
     </w:p>
     <w:p>
@@ -139,19 +125,7 @@
         <w:rPr>
           <w:rFonts w:ascii="Arial" w:hAnsi="Arial" w:cs="Arial"/>
         </w:rPr>
-        <w:t xml:space="preserve">Long Description </w:t>
-      </w:r>
-      <w:r>
-        <w:rPr>
-          <w:rFonts w:ascii="Arial" w:hAnsi="Arial" w:cs="Arial"/>
-        </w:rPr>
-        <w:t>-</w:t>
-      </w:r>
-      <w:r>
-        <w:rPr>
-          <w:rFonts w:ascii="Arial" w:hAnsi="Arial" w:cs="Arial"/>
-        </w:rPr>
-        <w:t xml:space="preserve"> Problem &amp; Solution Statement</w:t>
+        <w:t>Long Description - Problem &amp; Solution Statement</w:t>
       </w:r>
     </w:p>
     <w:p>
@@ -229,21 +203,7 @@
         <w:rPr>
           <w:rFonts w:ascii="Arial" w:hAnsi="Arial" w:cs="Arial"/>
         </w:rPr>
-        <w:t xml:space="preserve">derived from the ancient Greek word </w:t>
-      </w:r>
-      <w:proofErr w:type="spellStart"/>
-      <w:r>
-        <w:rPr>
-          <w:rFonts w:ascii="Arial" w:hAnsi="Arial" w:cs="Arial"/>
-        </w:rPr>
-        <w:t>ptōchos</w:t>
-      </w:r>
-      <w:proofErr w:type="spellEnd"/>
-      <w:r>
-        <w:rPr>
-          <w:rFonts w:ascii="Arial" w:hAnsi="Arial" w:cs="Arial"/>
-        </w:rPr>
-        <w:t>, symbolizing the strength in acknowledging our human limitations and our daily need for support</w:t>
+        <w:t>derived from the ancient Greek word ptōchos, symbolizing the strength in acknowledging our human limitations and our daily need for support</w:t>
       </w:r>
       <w:r>
         <w:rPr>
@@ -293,7 +253,7 @@
         <w:rPr>
           <w:rFonts w:ascii="Arial" w:hAnsi="Arial" w:cs="Arial"/>
         </w:rPr>
-        <w:t>to help the developer maintain peak cognitive function throughout the day. If metrics drop to critical lows, Po-Ko enters an "Active Support State". In this mode, the system automatically re-routes heavy cognitive tasks to healthy teammates and flags any code written by the compromised developer.</w:t>
+        <w:t>to help the developer maintain peak cognitive function throughout the day. If metrics drop to critical lows, Po-Ko enters an "Active Support State". In this mode, the system flags any code written by the compromised developer.</w:t>
       </w:r>
     </w:p>
     <w:p>
@@ -316,21 +276,21 @@
         <w:rPr>
           <w:rFonts w:ascii="Arial" w:hAnsi="Arial" w:cs="Arial"/>
         </w:rPr>
+        <w:t>Why It Is Unique</w:t>
+      </w:r>
+    </w:p>
+    <w:p>
+      <w:pPr>
+        <w:spacing w:line="276" w:lineRule="auto"/>
+        <w:rPr>
+          <w:rFonts w:ascii="Arial" w:hAnsi="Arial" w:cs="Arial"/>
+        </w:rPr>
+      </w:pPr>
+      <w:r>
+        <w:rPr>
+          <w:rFonts w:ascii="Arial" w:hAnsi="Arial" w:cs="Arial"/>
+        </w:rPr>
         <w:lastRenderedPageBreak/>
-        <w:t>Why It Is Unique</w:t>
-      </w:r>
-    </w:p>
-    <w:p>
-      <w:pPr>
-        <w:spacing w:line="276" w:lineRule="auto"/>
-        <w:rPr>
-          <w:rFonts w:ascii="Arial" w:hAnsi="Arial" w:cs="Arial"/>
-        </w:rPr>
-      </w:pPr>
-      <w:r>
-        <w:rPr>
-          <w:rFonts w:ascii="Arial" w:hAnsi="Arial" w:cs="Arial"/>
-        </w:rPr>
         <w:t>Po-Ko is completely local-first, utilizing a Node.js Model Context Protocol (MCP) server to ensure absolute biometric data privacy. Furthermore, it continuously builds upon the developer's historical biometric data. By combining this expanding dataset with progressive micro-surveys triggered in the IDE, the framework automatically adapts and personalizes its predictions to the individual over time, increasing accuracy with every logged day.</w:t>
       </w:r>
     </w:p>

</xml_diff>

<commit_message>
refactor security architecture and database migration
</commit_message>
<xml_diff>
--- a/Basic Information/Po-Ko Project.docx
+++ b/Basic Information/Po-Ko Project.docx
@@ -4,500 +4,744 @@
   <w:body>
     <w:p>
       <w:pPr>
-        <w:pStyle w:val="Heading1"/>
-        <w:spacing w:line="276" w:lineRule="auto"/>
-        <w:rPr>
-          <w:rFonts w:ascii="Arial" w:hAnsi="Arial" w:cs="Arial"/>
-        </w:rPr>
-      </w:pPr>
-      <w:r>
-        <w:rPr>
-          <w:rFonts w:ascii="Arial" w:hAnsi="Arial" w:cs="Arial"/>
+        <w:spacing w:after="100" w:afterAutospacing="1" w:line="240" w:lineRule="auto"/>
+        <w:outlineLvl w:val="1"/>
+        <w:rPr>
+          <w:rFonts w:ascii="Arial" w:eastAsia="Times New Roman" w:hAnsi="Arial" w:cs="Arial"/>
+          <w:b/>
+          <w:bCs/>
+          <w:sz w:val="36"/>
+          <w:szCs w:val="36"/>
+          <w:lang w:eastAsia="en-GB"/>
+          <w14:ligatures w14:val="none"/>
+        </w:rPr>
+      </w:pPr>
+      <w:r>
+        <w:rPr>
+          <w:rFonts w:ascii="Arial" w:eastAsia="Times New Roman" w:hAnsi="Arial" w:cs="Arial"/>
+          <w:b/>
+          <w:bCs/>
+          <w:sz w:val="36"/>
+          <w:szCs w:val="36"/>
+          <w:lang w:eastAsia="en-GB"/>
+          <w14:ligatures w14:val="none"/>
         </w:rPr>
         <w:t>Project Title</w:t>
       </w:r>
     </w:p>
     <w:p>
       <w:pPr>
-        <w:spacing w:line="276" w:lineRule="auto"/>
-        <w:rPr>
-          <w:rFonts w:ascii="Arial" w:hAnsi="Arial" w:cs="Arial"/>
-        </w:rPr>
-      </w:pPr>
-      <w:r>
-        <w:rPr>
-          <w:rFonts w:ascii="Arial" w:hAnsi="Arial" w:cs="Arial"/>
+        <w:spacing w:after="100" w:afterAutospacing="1" w:line="240" w:lineRule="auto"/>
+        <w:rPr>
+          <w:rFonts w:ascii="Arial" w:eastAsia="Times New Roman" w:hAnsi="Arial" w:cs="Arial"/>
+          <w:sz w:val="24"/>
+          <w:szCs w:val="24"/>
+          <w:lang w:eastAsia="en-GB"/>
+          <w14:ligatures w14:val="none"/>
+        </w:rPr>
+      </w:pPr>
+      <w:r>
+        <w:rPr>
+          <w:rFonts w:ascii="Arial" w:eastAsia="Times New Roman" w:hAnsi="Arial" w:cs="Arial"/>
+          <w:b/>
+          <w:bCs/>
+          <w:sz w:val="24"/>
+          <w:szCs w:val="24"/>
+          <w:lang w:eastAsia="en-GB"/>
+          <w14:ligatures w14:val="none"/>
         </w:rPr>
         <w:t>Po-Ko: The Predictive Developer Capacity Framework</w:t>
       </w:r>
     </w:p>
     <w:p>
       <w:pPr>
-        <w:spacing w:line="276" w:lineRule="auto"/>
-        <w:rPr>
-          <w:rFonts w:ascii="Arial" w:hAnsi="Arial" w:cs="Arial"/>
-        </w:rPr>
-      </w:pPr>
+        <w:spacing w:after="100" w:afterAutospacing="1" w:line="240" w:lineRule="auto"/>
+        <w:outlineLvl w:val="1"/>
+        <w:rPr>
+          <w:rFonts w:ascii="Arial" w:eastAsia="Times New Roman" w:hAnsi="Arial" w:cs="Arial"/>
+          <w:b/>
+          <w:bCs/>
+          <w:sz w:val="36"/>
+          <w:szCs w:val="36"/>
+          <w:lang w:eastAsia="en-GB"/>
+          <w14:ligatures w14:val="none"/>
+        </w:rPr>
+      </w:pPr>
+      <w:r>
+        <w:rPr>
+          <w:rFonts w:ascii="Arial" w:eastAsia="Times New Roman" w:hAnsi="Arial" w:cs="Arial"/>
+          <w:b/>
+          <w:bCs/>
+          <w:sz w:val="36"/>
+          <w:szCs w:val="36"/>
+          <w:lang w:eastAsia="en-GB"/>
+          <w14:ligatures w14:val="none"/>
+        </w:rPr>
+        <w:t>Short Description</w:t>
+      </w:r>
     </w:p>
     <w:p>
       <w:pPr>
-        <w:pStyle w:val="Heading1"/>
-        <w:spacing w:line="276" w:lineRule="auto"/>
-        <w:rPr>
-          <w:rFonts w:ascii="Arial" w:hAnsi="Arial" w:cs="Arial"/>
-        </w:rPr>
-      </w:pPr>
-      <w:r>
-        <w:rPr>
-          <w:rFonts w:ascii="Arial" w:hAnsi="Arial" w:cs="Arial"/>
-        </w:rPr>
-        <w:t>Short Description</w:t>
+        <w:spacing w:after="100" w:afterAutospacing="1" w:line="240" w:lineRule="auto"/>
+        <w:rPr>
+          <w:rFonts w:ascii="Arial" w:eastAsia="Times New Roman" w:hAnsi="Arial" w:cs="Arial"/>
+          <w:sz w:val="24"/>
+          <w:szCs w:val="24"/>
+          <w:lang w:eastAsia="en-GB"/>
+          <w14:ligatures w14:val="none"/>
+        </w:rPr>
+      </w:pPr>
+      <w:r>
+        <w:rPr>
+          <w:rFonts w:ascii="Arial" w:eastAsia="Times New Roman" w:hAnsi="Arial" w:cs="Arial"/>
+          <w:sz w:val="24"/>
+          <w:szCs w:val="24"/>
+          <w:lang w:eastAsia="en-GB"/>
+          <w14:ligatures w14:val="none"/>
+        </w:rPr>
+        <w:t xml:space="preserve">Po-Ko is an AI-powered developer capacity framework that runs as a local Model Context Protocol (MCP) server, integrating seamlessly into the IBM Bob IDE. Acting as a proactive daily caretaker, Po-Ko fuses wearable telemetry with a continuous machine learning engine to deliver time-specific health advice, predict fatigue, and shield developers from cognitive burnout without ever leaving their workspace. </w:t>
       </w:r>
     </w:p>
     <w:p>
       <w:pPr>
-        <w:spacing w:line="276" w:lineRule="auto"/>
-        <w:rPr>
-          <w:rFonts w:ascii="Arial" w:hAnsi="Arial" w:cs="Arial"/>
-        </w:rPr>
-      </w:pPr>
-      <w:r>
-        <w:rPr>
-          <w:rFonts w:ascii="Arial" w:hAnsi="Arial" w:cs="Arial"/>
-        </w:rPr>
-        <w:t>Po-Ko is an AI-powered developer capacity framework designed to prevent severe fatigue and the human biological interruptions that disrupt the software engineering workflow. Operating as a proactive daily caretaker via IBM Bob 2.0, Po-Ko continuously analyzes local biometric telemetry to deliver frequent, non-intrusive alerts, helping developers provide their bodies with exactly what is required to maintain optimal cognitive function. When severe illness occurs, the system enters an "Active Support State," safely re-routing heavy workloads and flagging code for future bug traceability.</w:t>
+        <w:spacing w:after="100" w:afterAutospacing="1" w:line="240" w:lineRule="auto"/>
+        <w:outlineLvl w:val="1"/>
+        <w:rPr>
+          <w:rFonts w:ascii="Arial" w:eastAsia="Times New Roman" w:hAnsi="Arial" w:cs="Arial"/>
+          <w:b/>
+          <w:bCs/>
+          <w:sz w:val="36"/>
+          <w:szCs w:val="36"/>
+          <w:lang w:eastAsia="en-GB"/>
+          <w14:ligatures w14:val="none"/>
+        </w:rPr>
+      </w:pPr>
+      <w:r>
+        <w:rPr>
+          <w:rFonts w:ascii="Arial" w:eastAsia="Times New Roman" w:hAnsi="Arial" w:cs="Arial"/>
+          <w:b/>
+          <w:bCs/>
+          <w:sz w:val="36"/>
+          <w:szCs w:val="36"/>
+          <w:lang w:eastAsia="en-GB"/>
+          <w14:ligatures w14:val="none"/>
+        </w:rPr>
+        <w:t>Technology &amp; Category Tags</w:t>
       </w:r>
     </w:p>
     <w:p>
       <w:pPr>
-        <w:spacing w:line="276" w:lineRule="auto"/>
-        <w:rPr>
-          <w:rFonts w:ascii="Arial" w:hAnsi="Arial" w:cs="Arial"/>
-        </w:rPr>
-      </w:pPr>
+        <w:spacing w:after="100" w:afterAutospacing="1" w:line="240" w:lineRule="auto"/>
+        <w:rPr>
+          <w:rFonts w:ascii="Arial" w:eastAsia="Times New Roman" w:hAnsi="Arial" w:cs="Arial"/>
+          <w:sz w:val="24"/>
+          <w:szCs w:val="24"/>
+          <w:lang w:eastAsia="en-GB"/>
+          <w14:ligatures w14:val="none"/>
+        </w:rPr>
+      </w:pPr>
+      <w:r>
+        <w:rPr>
+          <w:rFonts w:ascii="Arial" w:eastAsia="Times New Roman" w:hAnsi="Arial" w:cs="Arial"/>
+          <w:sz w:val="24"/>
+          <w:szCs w:val="24"/>
+          <w:lang w:eastAsia="en-GB"/>
+          <w14:ligatures w14:val="none"/>
+        </w:rPr>
+        <w:t xml:space="preserve">AI Assistant, Developer Tools, Health &amp; Wellness, Node.js, React, Vite, SQLite, Model Context Protocol (MCP), Predictive Analytics, Automation. </w:t>
+      </w:r>
     </w:p>
     <w:p>
       <w:pPr>
-        <w:pStyle w:val="Heading1"/>
-        <w:spacing w:line="276" w:lineRule="auto"/>
-        <w:rPr>
-          <w:rFonts w:ascii="Arial" w:hAnsi="Arial" w:cs="Arial"/>
-        </w:rPr>
-      </w:pPr>
-      <w:r>
-        <w:rPr>
-          <w:rFonts w:ascii="Arial" w:hAnsi="Arial" w:cs="Arial"/>
-        </w:rPr>
-        <w:t>Technology &amp; Category Tags</w:t>
+        <w:spacing w:after="100" w:afterAutospacing="1" w:line="240" w:lineRule="auto"/>
+        <w:outlineLvl w:val="1"/>
+        <w:rPr>
+          <w:rFonts w:ascii="Arial" w:eastAsia="Times New Roman" w:hAnsi="Arial" w:cs="Arial"/>
+          <w:b/>
+          <w:bCs/>
+          <w:sz w:val="36"/>
+          <w:szCs w:val="36"/>
+          <w:lang w:eastAsia="en-GB"/>
+          <w14:ligatures w14:val="none"/>
+        </w:rPr>
+      </w:pPr>
+      <w:r>
+        <w:rPr>
+          <w:rFonts w:ascii="Arial" w:eastAsia="Times New Roman" w:hAnsi="Arial" w:cs="Arial"/>
+          <w:b/>
+          <w:bCs/>
+          <w:sz w:val="36"/>
+          <w:szCs w:val="36"/>
+          <w:lang w:eastAsia="en-GB"/>
+          <w14:ligatures w14:val="none"/>
+        </w:rPr>
+        <w:t>Long Description (Problem &amp; Solution Statement)</w:t>
       </w:r>
     </w:p>
     <w:p>
       <w:pPr>
-        <w:spacing w:line="276" w:lineRule="auto"/>
-        <w:rPr>
-          <w:rFonts w:ascii="Arial" w:hAnsi="Arial" w:cs="Arial"/>
-        </w:rPr>
-      </w:pPr>
-      <w:r>
-        <w:rPr>
-          <w:rFonts w:ascii="Arial" w:hAnsi="Arial" w:cs="Arial"/>
-        </w:rPr>
-        <w:t>AI Assistant, Developer Tools, Health &amp; Wellness, Node.js, React, Model Context Protocol (MCP), Predictive Analytics, Automation.</w:t>
+        <w:spacing w:after="100" w:afterAutospacing="1" w:line="240" w:lineRule="auto"/>
+        <w:rPr>
+          <w:rFonts w:ascii="Arial" w:eastAsia="Times New Roman" w:hAnsi="Arial" w:cs="Arial"/>
+          <w:sz w:val="24"/>
+          <w:szCs w:val="24"/>
+          <w:lang w:eastAsia="en-GB"/>
+          <w14:ligatures w14:val="none"/>
+        </w:rPr>
+      </w:pPr>
+      <w:r>
+        <w:rPr>
+          <w:rFonts w:ascii="Arial" w:eastAsia="Times New Roman" w:hAnsi="Arial" w:cs="Arial"/>
+          <w:b/>
+          <w:bCs/>
+          <w:sz w:val="24"/>
+          <w:szCs w:val="24"/>
+          <w:lang w:eastAsia="en-GB"/>
+          <w14:ligatures w14:val="none"/>
+        </w:rPr>
+        <w:t>The Problem</w:t>
+      </w:r>
+      <w:r>
+        <w:rPr>
+          <w:rFonts w:ascii="Arial" w:eastAsia="Times New Roman" w:hAnsi="Arial" w:cs="Arial"/>
+          <w:sz w:val="24"/>
+          <w:szCs w:val="24"/>
+          <w:lang w:eastAsia="en-GB"/>
+          <w14:ligatures w14:val="none"/>
+        </w:rPr>
+        <w:t xml:space="preserve"> The software engineering industry operates on the flawed assumption of infinite human capacity. Severe fatigue and human biological interruptions are massive disruptors to developer workflows. When a developer is fighting off an illness or is severely exhausted, cognitive function drops: code review quality plummets, syntax errors compound, and critical deployments are put at risk. Current market solutions only warn users about physical vulnerability, leaving developers to manage their complex workloads entirely on their own. </w:t>
       </w:r>
     </w:p>
     <w:p>
       <w:pPr>
-        <w:spacing w:line="276" w:lineRule="auto"/>
-        <w:rPr>
-          <w:rFonts w:ascii="Arial" w:hAnsi="Arial" w:cs="Arial"/>
-        </w:rPr>
-      </w:pPr>
+        <w:spacing w:after="100" w:afterAutospacing="1" w:line="240" w:lineRule="auto"/>
+        <w:rPr>
+          <w:rFonts w:ascii="Arial" w:eastAsia="Times New Roman" w:hAnsi="Arial" w:cs="Arial"/>
+          <w:sz w:val="24"/>
+          <w:szCs w:val="24"/>
+          <w:lang w:eastAsia="en-GB"/>
+          <w14:ligatures w14:val="none"/>
+        </w:rPr>
+      </w:pPr>
+      <w:r>
+        <w:rPr>
+          <w:rFonts w:ascii="Arial" w:eastAsia="Times New Roman" w:hAnsi="Arial" w:cs="Arial"/>
+          <w:b/>
+          <w:bCs/>
+          <w:sz w:val="24"/>
+          <w:szCs w:val="24"/>
+          <w:lang w:eastAsia="en-GB"/>
+          <w14:ligatures w14:val="none"/>
+        </w:rPr>
+        <w:t>The Solution</w:t>
+      </w:r>
+      <w:r>
+        <w:rPr>
+          <w:rFonts w:ascii="Arial" w:eastAsia="Times New Roman" w:hAnsi="Arial" w:cs="Arial"/>
+          <w:sz w:val="24"/>
+          <w:szCs w:val="24"/>
+          <w:lang w:eastAsia="en-GB"/>
+          <w14:ligatures w14:val="none"/>
+        </w:rPr>
+        <w:t xml:space="preserve"> Po-Ko—derived from the ancient Greek word </w:t>
+      </w:r>
+      <w:proofErr w:type="spellStart"/>
+      <w:r>
+        <w:rPr>
+          <w:rFonts w:ascii="Arial" w:eastAsia="Times New Roman" w:hAnsi="Arial" w:cs="Arial"/>
+          <w:i/>
+          <w:iCs/>
+          <w:sz w:val="24"/>
+          <w:szCs w:val="24"/>
+          <w:lang w:eastAsia="en-GB"/>
+          <w14:ligatures w14:val="none"/>
+        </w:rPr>
+        <w:t>ptōchos</w:t>
+      </w:r>
+      <w:proofErr w:type="spellEnd"/>
+      <w:r>
+        <w:rPr>
+          <w:rFonts w:ascii="Arial" w:eastAsia="Times New Roman" w:hAnsi="Arial" w:cs="Arial"/>
+          <w:sz w:val="24"/>
+          <w:szCs w:val="24"/>
+          <w:lang w:eastAsia="en-GB"/>
+          <w14:ligatures w14:val="none"/>
+        </w:rPr>
+        <w:t xml:space="preserve">, symbolizing the strength in acknowledging our limitations and our daily need for support—is a proactive developer capacity framework. It functions as a daily caretaker, utilizing a dynamic Po-Ko Scoring Algorithm (1–10) that fuses internal biometric vulnerability (Garmin Overnight HRV, Sleep Score, and Stress) with external exposure data gathered via intelligent micro-surveys. </w:t>
+      </w:r>
     </w:p>
     <w:p>
       <w:pPr>
-        <w:pStyle w:val="Heading1"/>
-        <w:spacing w:line="276" w:lineRule="auto"/>
-        <w:rPr>
-          <w:rFonts w:ascii="Arial" w:hAnsi="Arial" w:cs="Arial"/>
-        </w:rPr>
-      </w:pPr>
-      <w:r>
-        <w:rPr>
-          <w:rFonts w:ascii="Arial" w:hAnsi="Arial" w:cs="Arial"/>
-        </w:rPr>
-        <w:t>Long Description - Problem &amp; Solution Statement</w:t>
+        <w:spacing w:after="100" w:afterAutospacing="1" w:line="240" w:lineRule="auto"/>
+        <w:rPr>
+          <w:rFonts w:ascii="Arial" w:eastAsia="Times New Roman" w:hAnsi="Arial" w:cs="Arial"/>
+          <w:sz w:val="24"/>
+          <w:szCs w:val="24"/>
+          <w:lang w:eastAsia="en-GB"/>
+          <w14:ligatures w14:val="none"/>
+        </w:rPr>
+      </w:pPr>
+      <w:r>
+        <w:rPr>
+          <w:rFonts w:ascii="Arial" w:eastAsia="Times New Roman" w:hAnsi="Arial" w:cs="Arial"/>
+          <w:b/>
+          <w:bCs/>
+          <w:sz w:val="24"/>
+          <w:szCs w:val="24"/>
+          <w:lang w:eastAsia="en-GB"/>
+          <w14:ligatures w14:val="none"/>
+        </w:rPr>
+        <w:t>Target Users &amp; Interaction</w:t>
+      </w:r>
+      <w:r>
+        <w:rPr>
+          <w:rFonts w:ascii="Arial" w:eastAsia="Times New Roman" w:hAnsi="Arial" w:cs="Arial"/>
+          <w:sz w:val="24"/>
+          <w:szCs w:val="24"/>
+          <w:lang w:eastAsia="en-GB"/>
+          <w14:ligatures w14:val="none"/>
+        </w:rPr>
+        <w:t xml:space="preserve"> Designed for software engineers, Po-Ko makes the </w:t>
+      </w:r>
+      <w:r>
+        <w:rPr>
+          <w:rFonts w:ascii="Arial" w:eastAsia="Times New Roman" w:hAnsi="Arial" w:cs="Arial"/>
+          <w:b/>
+          <w:bCs/>
+          <w:sz w:val="24"/>
+          <w:szCs w:val="24"/>
+          <w:lang w:eastAsia="en-GB"/>
+          <w14:ligatures w14:val="none"/>
+        </w:rPr>
+        <w:t>IBM Bob IDE its primary interaction surface</w:t>
+      </w:r>
+      <w:r>
+        <w:rPr>
+          <w:rFonts w:ascii="Arial" w:eastAsia="Times New Roman" w:hAnsi="Arial" w:cs="Arial"/>
+          <w:sz w:val="24"/>
+          <w:szCs w:val="24"/>
+          <w:lang w:eastAsia="en-GB"/>
+          <w14:ligatures w14:val="none"/>
+        </w:rPr>
+        <w:t xml:space="preserve">. Through a custom Model Context Protocol (MCP) server, developers can interact directly with IBM Bob in their chat window to check their real-time Po-Ko capacity score, log daily metrics, report lifestyle context (external factors), and receive time-specific contextual health advice (morning, midday, afternoon). A comprehensive Vite/React web dashboard serves as a secondary full-view screen, offering detailed score breakdowns, explainability tooltips, and a 30-day recovery trend chart. </w:t>
       </w:r>
     </w:p>
     <w:p>
       <w:pPr>
-        <w:pStyle w:val="Heading2"/>
-        <w:spacing w:line="276" w:lineRule="auto"/>
-        <w:rPr>
-          <w:rFonts w:ascii="Arial" w:hAnsi="Arial" w:cs="Arial"/>
-        </w:rPr>
-      </w:pPr>
-      <w:r>
-        <w:rPr>
-          <w:rFonts w:ascii="Arial" w:hAnsi="Arial" w:cs="Arial"/>
-        </w:rPr>
-        <w:t>The Problem</w:t>
+        <w:spacing w:after="100" w:afterAutospacing="1" w:line="240" w:lineRule="auto"/>
+        <w:rPr>
+          <w:rFonts w:ascii="Arial" w:eastAsia="Times New Roman" w:hAnsi="Arial" w:cs="Arial"/>
+          <w:sz w:val="24"/>
+          <w:szCs w:val="24"/>
+          <w:lang w:eastAsia="en-GB"/>
+          <w14:ligatures w14:val="none"/>
+        </w:rPr>
+      </w:pPr>
+      <w:r>
+        <w:rPr>
+          <w:rFonts w:ascii="Arial" w:eastAsia="Times New Roman" w:hAnsi="Arial" w:cs="Arial"/>
+          <w:b/>
+          <w:bCs/>
+          <w:sz w:val="24"/>
+          <w:szCs w:val="24"/>
+          <w:lang w:eastAsia="en-GB"/>
+          <w14:ligatures w14:val="none"/>
+        </w:rPr>
+        <w:t>Why It Is Creative &amp; Unique</w:t>
       </w:r>
     </w:p>
     <w:p>
       <w:pPr>
-        <w:spacing w:line="276" w:lineRule="auto"/>
-        <w:rPr>
-          <w:rFonts w:ascii="Arial" w:hAnsi="Arial" w:cs="Arial"/>
-        </w:rPr>
-      </w:pPr>
-      <w:r>
-        <w:rPr>
-          <w:rFonts w:ascii="Arial" w:hAnsi="Arial" w:cs="Arial"/>
-        </w:rPr>
-        <w:t>The software engineering industry operates on the flawed assumption of infinite human capacity. Severe fatigue and human biological interruptions are massive disruptors to developer workflows. When a developer is fighting off an illness or is severely exhausted, their cognitive function drops: code review quality plummets, syntax errors compound, and critical deployments are put at risk. Current market solutions only warn users about physical vulnerability, leaving developers to manage their complex workloads entirely on their own.</w:t>
+        <w:spacing w:after="100" w:afterAutospacing="1" w:line="240" w:lineRule="auto"/>
+        <w:rPr>
+          <w:rFonts w:ascii="Arial" w:eastAsia="Times New Roman" w:hAnsi="Arial" w:cs="Arial"/>
+          <w:sz w:val="24"/>
+          <w:szCs w:val="24"/>
+          <w:lang w:eastAsia="en-GB"/>
+          <w14:ligatures w14:val="none"/>
+        </w:rPr>
+      </w:pPr>
+      <w:r>
+        <w:rPr>
+          <w:rFonts w:ascii="Arial" w:eastAsia="Times New Roman" w:hAnsi="Arial" w:cs="Arial"/>
+          <w:sz w:val="24"/>
+          <w:szCs w:val="24"/>
+          <w:lang w:eastAsia="en-GB"/>
+          <w14:ligatures w14:val="none"/>
+        </w:rPr>
+        <w:t>Po-Ko addresses developer burnout in entirely new ways:</w:t>
       </w:r>
     </w:p>
     <w:p>
       <w:pPr>
-        <w:spacing w:line="276" w:lineRule="auto"/>
-        <w:rPr>
-          <w:rFonts w:ascii="Arial" w:hAnsi="Arial" w:cs="Arial"/>
-        </w:rPr>
-      </w:pPr>
+        <w:numPr>
+          <w:ilvl w:val="0"/>
+          <w:numId w:val="1"/>
+        </w:numPr>
+        <w:spacing w:after="100" w:afterAutospacing="1" w:line="240" w:lineRule="auto"/>
+        <w:rPr>
+          <w:rFonts w:ascii="Arial" w:eastAsia="Times New Roman" w:hAnsi="Arial" w:cs="Arial"/>
+          <w:sz w:val="24"/>
+          <w:szCs w:val="24"/>
+          <w:lang w:eastAsia="en-GB"/>
+          <w14:ligatures w14:val="none"/>
+        </w:rPr>
+      </w:pPr>
+      <w:r>
+        <w:rPr>
+          <w:rFonts w:ascii="Arial" w:eastAsia="Times New Roman" w:hAnsi="Arial" w:cs="Arial"/>
+          <w:b/>
+          <w:bCs/>
+          <w:sz w:val="24"/>
+          <w:szCs w:val="24"/>
+          <w:lang w:eastAsia="en-GB"/>
+          <w14:ligatures w14:val="none"/>
+        </w:rPr>
+        <w:lastRenderedPageBreak/>
+        <w:t>100% Local-First Privacy:</w:t>
+      </w:r>
+      <w:r>
+        <w:rPr>
+          <w:rFonts w:ascii="Arial" w:eastAsia="Times New Roman" w:hAnsi="Arial" w:cs="Arial"/>
+          <w:sz w:val="24"/>
+          <w:szCs w:val="24"/>
+          <w:lang w:eastAsia="en-GB"/>
+          <w14:ligatures w14:val="none"/>
+        </w:rPr>
+        <w:t xml:space="preserve"> All telemetry is stored in a local SQLite database, ensuring zero biometric data leakage. </w:t>
+      </w:r>
     </w:p>
     <w:p>
       <w:pPr>
-        <w:pStyle w:val="Heading2"/>
-        <w:spacing w:line="276" w:lineRule="auto"/>
-        <w:rPr>
-          <w:rFonts w:ascii="Arial" w:hAnsi="Arial" w:cs="Arial"/>
-        </w:rPr>
-      </w:pPr>
-      <w:r>
-        <w:rPr>
-          <w:rFonts w:ascii="Arial" w:hAnsi="Arial" w:cs="Arial"/>
-        </w:rPr>
-        <w:t>The Solution</w:t>
+        <w:numPr>
+          <w:ilvl w:val="0"/>
+          <w:numId w:val="1"/>
+        </w:numPr>
+        <w:spacing w:after="100" w:afterAutospacing="1" w:line="240" w:lineRule="auto"/>
+        <w:rPr>
+          <w:rFonts w:ascii="Arial" w:eastAsia="Times New Roman" w:hAnsi="Arial" w:cs="Arial"/>
+          <w:sz w:val="24"/>
+          <w:szCs w:val="24"/>
+          <w:lang w:eastAsia="en-GB"/>
+          <w14:ligatures w14:val="none"/>
+        </w:rPr>
+      </w:pPr>
+      <w:r>
+        <w:rPr>
+          <w:rFonts w:ascii="Arial" w:eastAsia="Times New Roman" w:hAnsi="Arial" w:cs="Arial"/>
+          <w:b/>
+          <w:bCs/>
+          <w:sz w:val="24"/>
+          <w:szCs w:val="24"/>
+          <w:lang w:eastAsia="en-GB"/>
+          <w14:ligatures w14:val="none"/>
+        </w:rPr>
+        <w:t>Continuous Learning Engine:</w:t>
+      </w:r>
+      <w:r>
+        <w:rPr>
+          <w:rFonts w:ascii="Arial" w:eastAsia="Times New Roman" w:hAnsi="Arial" w:cs="Arial"/>
+          <w:sz w:val="24"/>
+          <w:szCs w:val="24"/>
+          <w:lang w:eastAsia="en-GB"/>
+          <w14:ligatures w14:val="none"/>
+        </w:rPr>
+        <w:t xml:space="preserve"> The system scans entire biometric histories to detect recurring, multi-day signatures that precede logged sick days, automatically generating new detection rules and pattern warnings tailored to the individual. </w:t>
       </w:r>
     </w:p>
     <w:p>
       <w:pPr>
-        <w:spacing w:line="276" w:lineRule="auto"/>
-        <w:rPr>
-          <w:rFonts w:ascii="Arial" w:hAnsi="Arial" w:cs="Arial"/>
-        </w:rPr>
-      </w:pPr>
-      <w:r>
-        <w:rPr>
-          <w:rFonts w:ascii="Arial" w:hAnsi="Arial" w:cs="Arial"/>
-        </w:rPr>
-        <w:t>Po-Ko</w:t>
-      </w:r>
-      <w:r>
-        <w:rPr>
-          <w:rFonts w:ascii="Arial" w:hAnsi="Arial" w:cs="Arial"/>
-        </w:rPr>
-        <w:t xml:space="preserve"> - </w:t>
-      </w:r>
-      <w:r>
-        <w:rPr>
-          <w:rFonts w:ascii="Arial" w:hAnsi="Arial" w:cs="Arial"/>
-        </w:rPr>
-        <w:t>derived from the ancient Greek word ptōchos, symbolizing the strength in acknowledging our human limitations and our daily need for support</w:t>
-      </w:r>
-      <w:r>
-        <w:rPr>
-          <w:rFonts w:ascii="Arial" w:hAnsi="Arial" w:cs="Arial"/>
-        </w:rPr>
-        <w:t xml:space="preserve"> - </w:t>
-      </w:r>
-      <w:r>
-        <w:rPr>
-          <w:rFonts w:ascii="Arial" w:hAnsi="Arial" w:cs="Arial"/>
-        </w:rPr>
-        <w:t>is a proactive developer capacity framework. It functions as a daily caretaker, utilizing a Two-Factor Risk Matrix that combines internal biometric vulnerability (Garmin HRV, Resting Heart Rate, and Stress) with external exposure data gathered via VS Code micro-surveys.</w:t>
+        <w:numPr>
+          <w:ilvl w:val="0"/>
+          <w:numId w:val="1"/>
+        </w:numPr>
+        <w:spacing w:after="100" w:afterAutospacing="1" w:line="240" w:lineRule="auto"/>
+        <w:rPr>
+          <w:rFonts w:ascii="Arial" w:eastAsia="Times New Roman" w:hAnsi="Arial" w:cs="Arial"/>
+          <w:sz w:val="24"/>
+          <w:szCs w:val="24"/>
+          <w:lang w:eastAsia="en-GB"/>
+          <w14:ligatures w14:val="none"/>
+        </w:rPr>
+      </w:pPr>
+      <w:r>
+        <w:rPr>
+          <w:rFonts w:ascii="Arial" w:eastAsia="Times New Roman" w:hAnsi="Arial" w:cs="Arial"/>
+          <w:b/>
+          <w:bCs/>
+          <w:sz w:val="24"/>
+          <w:szCs w:val="24"/>
+          <w:lang w:eastAsia="en-GB"/>
+          <w14:ligatures w14:val="none"/>
+        </w:rPr>
+        <w:t>Predictive Shielding:</w:t>
+      </w:r>
+      <w:r>
+        <w:rPr>
+          <w:rFonts w:ascii="Arial" w:eastAsia="Times New Roman" w:hAnsi="Arial" w:cs="Arial"/>
+          <w:sz w:val="24"/>
+          <w:szCs w:val="24"/>
+          <w:lang w:eastAsia="en-GB"/>
+          <w14:ligatures w14:val="none"/>
+        </w:rPr>
+        <w:t xml:space="preserve"> Features like the "72-Hour Rebound Rule" detect impending illness before symptoms arise. If a developer is in an "Active Support State," the "Code Guardian" classifies the cognitive weight of their Pull Requests and attaches traceability flags to high-risk code pushes to aid in future bug hunts. </w:t>
       </w:r>
     </w:p>
     <w:p>
       <w:pPr>
-        <w:spacing w:line="276" w:lineRule="auto"/>
-        <w:rPr>
-          <w:rFonts w:ascii="Arial" w:hAnsi="Arial" w:cs="Arial"/>
-        </w:rPr>
-      </w:pPr>
-      <w:r>
-        <w:rPr>
-          <w:rFonts w:ascii="Arial" w:hAnsi="Arial" w:cs="Arial"/>
-        </w:rPr>
-        <w:t>Instead of demanding a developer stop working, Po-Ko provides sustenance. It delivers frequent, non-intrusive alerts</w:t>
-      </w:r>
-      <w:r>
-        <w:rPr>
-          <w:rFonts w:ascii="Arial" w:hAnsi="Arial" w:cs="Arial"/>
-        </w:rPr>
-        <w:t xml:space="preserve"> - </w:t>
-      </w:r>
-      <w:r>
-        <w:rPr>
-          <w:rFonts w:ascii="Arial" w:hAnsi="Arial" w:cs="Arial"/>
-        </w:rPr>
-        <w:t>such as hydration, nutrition, and pacing prompts</w:t>
-      </w:r>
-      <w:r>
-        <w:rPr>
-          <w:rFonts w:ascii="Arial" w:hAnsi="Arial" w:cs="Arial"/>
-        </w:rPr>
-        <w:t xml:space="preserve"> - </w:t>
-      </w:r>
-      <w:r>
-        <w:rPr>
-          <w:rFonts w:ascii="Arial" w:hAnsi="Arial" w:cs="Arial"/>
-        </w:rPr>
-        <w:t>to help the developer maintain peak cognitive function throughout the day. If metrics drop to critical lows, Po-Ko enters an "Active Support State". In this mode, the system flags any code written by the compromised developer.</w:t>
+        <w:pStyle w:val="Heading1"/>
+      </w:pPr>
+      <w:r>
+        <w:t>IBM Bob Usage Statement</w:t>
       </w:r>
     </w:p>
     <w:p>
       <w:pPr>
-        <w:spacing w:line="276" w:lineRule="auto"/>
-        <w:rPr>
-          <w:rFonts w:ascii="Arial" w:hAnsi="Arial" w:cs="Arial"/>
-        </w:rPr>
-      </w:pPr>
+        <w:pStyle w:val="NormalWeb"/>
+        <w:rPr>
+          <w:rFonts w:ascii="Arial" w:hAnsi="Arial" w:cs="Arial"/>
+        </w:rPr>
+      </w:pPr>
+      <w:r>
+        <w:rPr>
+          <w:rFonts w:ascii="Arial" w:hAnsi="Arial" w:cs="Arial"/>
+          <w:b/>
+          <w:bCs/>
+        </w:rPr>
+        <w:t>How IBM Bob 2.0 Powered Po-Ko</w:t>
+      </w:r>
+      <w:r>
+        <w:rPr>
+          <w:rFonts w:ascii="Arial" w:hAnsi="Arial" w:cs="Arial"/>
+        </w:rPr>
+        <w:t xml:space="preserve"> Operating under the strict 40-Bobcoin limit, we deployed IBM Bob IDE exclusively as our high-level software architect and active reasoning layer. We utilized Bob 2.0’s core capabilities to build the complex components of our predictive framework, generating the logic against our sanitized, 191-day local dataset.</w:t>
+      </w:r>
     </w:p>
     <w:p>
       <w:pPr>
-        <w:pStyle w:val="Heading2"/>
-        <w:spacing w:line="276" w:lineRule="auto"/>
-        <w:rPr>
-          <w:rFonts w:ascii="Arial" w:hAnsi="Arial" w:cs="Arial"/>
-        </w:rPr>
-      </w:pPr>
-      <w:r>
-        <w:rPr>
-          <w:rFonts w:ascii="Arial" w:hAnsi="Arial" w:cs="Arial"/>
-        </w:rPr>
-        <w:t>Why It Is Unique</w:t>
+        <w:pStyle w:val="NormalWeb"/>
+        <w:numPr>
+          <w:ilvl w:val="0"/>
+          <w:numId w:val="2"/>
+        </w:numPr>
+        <w:rPr>
+          <w:rFonts w:ascii="Arial" w:hAnsi="Arial" w:cs="Arial"/>
+        </w:rPr>
+      </w:pPr>
+      <w:r>
+        <w:rPr>
+          <w:rFonts w:ascii="Arial" w:hAnsi="Arial" w:cs="Arial"/>
+          <w:b/>
+          <w:bCs/>
+        </w:rPr>
+        <w:t>Agent Mode &amp; Continuous Learning (The Telemetry Subagent):</w:t>
+      </w:r>
+      <w:r>
+        <w:rPr>
+          <w:rFonts w:ascii="Arial" w:hAnsi="Arial" w:cs="Arial"/>
+        </w:rPr>
+        <w:t xml:space="preserve"> We used Bob IDE to architect the local predictive engine (</w:t>
+      </w:r>
+      <w:r>
+        <w:rPr>
+          <w:rStyle w:val="HTMLCode"/>
+          <w:rFonts w:ascii="Arial" w:hAnsi="Arial" w:cs="Arial"/>
+        </w:rPr>
+        <w:t>pokoScoring.js</w:t>
+      </w:r>
+      <w:r>
+        <w:rPr>
+          <w:rFonts w:ascii="Arial" w:hAnsi="Arial" w:cs="Arial"/>
+        </w:rPr>
+        <w:t xml:space="preserve">) and the dynamic </w:t>
+      </w:r>
+      <w:r>
+        <w:rPr>
+          <w:rStyle w:val="HTMLCode"/>
+          <w:rFonts w:ascii="Arial" w:hAnsi="Arial" w:cs="Arial"/>
+        </w:rPr>
+        <w:t>learningEngine.js</w:t>
+      </w:r>
+      <w:r>
+        <w:rPr>
+          <w:rFonts w:ascii="Arial" w:hAnsi="Arial" w:cs="Arial"/>
+        </w:rPr>
+        <w:t xml:space="preserve">. Crucially, Bob helped us implement the continuous learning loop by scripting MCP client calls that allow the framework to autonomously </w:t>
+      </w:r>
+      <w:proofErr w:type="spellStart"/>
+      <w:r>
+        <w:rPr>
+          <w:rFonts w:ascii="Arial" w:hAnsi="Arial" w:cs="Arial"/>
+        </w:rPr>
+        <w:t>analyze</w:t>
+      </w:r>
+      <w:proofErr w:type="spellEnd"/>
+      <w:r>
+        <w:rPr>
+          <w:rFonts w:ascii="Arial" w:hAnsi="Arial" w:cs="Arial"/>
+        </w:rPr>
+        <w:t xml:space="preserve"> historical biometric patterns, generate personalized threshold rules, and write custom detection algorithms.</w:t>
       </w:r>
     </w:p>
     <w:p>
       <w:pPr>
-        <w:spacing w:line="276" w:lineRule="auto"/>
-        <w:rPr>
-          <w:rFonts w:ascii="Arial" w:hAnsi="Arial" w:cs="Arial"/>
-        </w:rPr>
-      </w:pPr>
-      <w:r>
-        <w:rPr>
-          <w:rFonts w:ascii="Arial" w:hAnsi="Arial" w:cs="Arial"/>
-        </w:rPr>
-        <w:lastRenderedPageBreak/>
-        <w:t>Po-Ko is completely local-first, utilizing a Node.js Model Context Protocol (MCP) server to ensure absolute biometric data privacy. Furthermore, it continuously builds upon the developer's historical biometric data. By combining this expanding dataset with progressive micro-surveys triggered in the IDE, the framework automatically adapts and personalizes its predictions to the individual over time, increasing accuracy with every logged day.</w:t>
+        <w:pStyle w:val="NormalWeb"/>
+        <w:numPr>
+          <w:ilvl w:val="0"/>
+          <w:numId w:val="2"/>
+        </w:numPr>
+        <w:rPr>
+          <w:rFonts w:ascii="Arial" w:hAnsi="Arial" w:cs="Arial"/>
+        </w:rPr>
+      </w:pPr>
+      <w:r>
+        <w:rPr>
+          <w:rFonts w:ascii="Arial" w:hAnsi="Arial" w:cs="Arial"/>
+          <w:b/>
+          <w:bCs/>
+        </w:rPr>
+        <w:t>Model Context Protocol (MCP) Architecture:</w:t>
+      </w:r>
+      <w:r>
+        <w:rPr>
+          <w:rFonts w:ascii="Arial" w:hAnsi="Arial" w:cs="Arial"/>
+        </w:rPr>
+        <w:t xml:space="preserve"> To create seamless IDE interventions, Bob built our local MCP server (</w:t>
+      </w:r>
+      <w:r>
+        <w:rPr>
+          <w:rStyle w:val="HTMLCode"/>
+          <w:rFonts w:ascii="Arial" w:hAnsi="Arial" w:cs="Arial"/>
+        </w:rPr>
+        <w:t>server/mcp.js</w:t>
+      </w:r>
+      <w:r>
+        <w:rPr>
+          <w:rFonts w:ascii="Arial" w:hAnsi="Arial" w:cs="Arial"/>
+        </w:rPr>
+        <w:t xml:space="preserve">) from the ground up. This included establishing the </w:t>
+      </w:r>
+      <w:proofErr w:type="spellStart"/>
+      <w:r>
+        <w:rPr>
+          <w:rStyle w:val="HTMLCode"/>
+          <w:rFonts w:ascii="Arial" w:hAnsi="Arial" w:cs="Arial"/>
+        </w:rPr>
+        <w:t>stdio</w:t>
+      </w:r>
+      <w:proofErr w:type="spellEnd"/>
+      <w:r>
+        <w:rPr>
+          <w:rFonts w:ascii="Arial" w:hAnsi="Arial" w:cs="Arial"/>
+        </w:rPr>
+        <w:t xml:space="preserve"> transport layer and registering custom tools (</w:t>
+      </w:r>
+      <w:proofErr w:type="spellStart"/>
+      <w:r>
+        <w:rPr>
+          <w:rStyle w:val="HTMLCode"/>
+          <w:rFonts w:ascii="Arial" w:hAnsi="Arial" w:cs="Arial"/>
+        </w:rPr>
+        <w:t>get_poko_status</w:t>
+      </w:r>
+      <w:proofErr w:type="spellEnd"/>
+      <w:r>
+        <w:rPr>
+          <w:rFonts w:ascii="Arial" w:hAnsi="Arial" w:cs="Arial"/>
+        </w:rPr>
+        <w:t xml:space="preserve">, </w:t>
+      </w:r>
+      <w:proofErr w:type="spellStart"/>
+      <w:r>
+        <w:rPr>
+          <w:rStyle w:val="HTMLCode"/>
+          <w:rFonts w:ascii="Arial" w:hAnsi="Arial" w:cs="Arial"/>
+        </w:rPr>
+        <w:t>submit_survey</w:t>
+      </w:r>
+      <w:proofErr w:type="spellEnd"/>
+      <w:r>
+        <w:rPr>
+          <w:rFonts w:ascii="Arial" w:hAnsi="Arial" w:cs="Arial"/>
+        </w:rPr>
+        <w:t xml:space="preserve">, </w:t>
+      </w:r>
+      <w:proofErr w:type="spellStart"/>
+      <w:r>
+        <w:rPr>
+          <w:rStyle w:val="HTMLCode"/>
+          <w:rFonts w:ascii="Arial" w:hAnsi="Arial" w:cs="Arial"/>
+        </w:rPr>
+        <w:t>get_advice</w:t>
+      </w:r>
+      <w:proofErr w:type="spellEnd"/>
+      <w:r>
+        <w:rPr>
+          <w:rFonts w:ascii="Arial" w:hAnsi="Arial" w:cs="Arial"/>
+        </w:rPr>
+        <w:t>) that wire the Po-Ko framework directly into the IBM Bob IDE workflow.</w:t>
       </w:r>
     </w:p>
     <w:p>
       <w:pPr>
-        <w:spacing w:line="276" w:lineRule="auto"/>
-        <w:rPr>
-          <w:rFonts w:ascii="Arial" w:hAnsi="Arial" w:cs="Arial"/>
-        </w:rPr>
-      </w:pPr>
+        <w:pStyle w:val="NormalWeb"/>
+        <w:numPr>
+          <w:ilvl w:val="0"/>
+          <w:numId w:val="2"/>
+        </w:numPr>
+        <w:rPr>
+          <w:rFonts w:ascii="Arial" w:hAnsi="Arial" w:cs="Arial"/>
+        </w:rPr>
+      </w:pPr>
+      <w:r>
+        <w:rPr>
+          <w:rFonts w:ascii="Arial" w:hAnsi="Arial" w:cs="Arial"/>
+          <w:b/>
+          <w:bCs/>
+        </w:rPr>
+        <w:t>Document Understanding (The Context Subagent):</w:t>
+      </w:r>
+      <w:r>
+        <w:rPr>
+          <w:rFonts w:ascii="Arial" w:hAnsi="Arial" w:cs="Arial"/>
+        </w:rPr>
+        <w:t xml:space="preserve"> We leveraged Bob 2.0’s Document Understanding to build our "Code Guardian" feature. Bob wrote the script that scans GitHub PR descriptions and codebase structures to classify upcoming tasks by cognitive weight, intelligently fusing biometric data with self-reported micro-surveys. If the score triggers an "Active Support State," Bob’s logic applies a metadata flag to the pushed code for future bug traceability.</w:t>
+      </w:r>
     </w:p>
     <w:p>
       <w:pPr>
-        <w:pStyle w:val="Heading1"/>
-        <w:spacing w:line="276" w:lineRule="auto"/>
-        <w:rPr>
-          <w:rFonts w:ascii="Arial" w:hAnsi="Arial" w:cs="Arial"/>
-          <w:sz w:val="28"/>
-          <w:szCs w:val="28"/>
-        </w:rPr>
-      </w:pPr>
-      <w:r>
-        <w:rPr>
-          <w:rFonts w:ascii="Arial" w:hAnsi="Arial" w:cs="Arial"/>
-          <w:sz w:val="28"/>
-          <w:szCs w:val="28"/>
-        </w:rPr>
-        <w:t>IBM Bob Usage Statement</w:t>
+        <w:pStyle w:val="NormalWeb"/>
+        <w:numPr>
+          <w:ilvl w:val="0"/>
+          <w:numId w:val="2"/>
+        </w:numPr>
+        <w:rPr>
+          <w:rFonts w:ascii="Arial" w:hAnsi="Arial" w:cs="Arial"/>
+        </w:rPr>
+      </w:pPr>
+      <w:r>
+        <w:rPr>
+          <w:rFonts w:ascii="Arial" w:hAnsi="Arial" w:cs="Arial"/>
+          <w:b/>
+          <w:bCs/>
+        </w:rPr>
+        <w:t>Rapid Prototyping &amp; Integration Stabilization:</w:t>
+      </w:r>
+      <w:r>
+        <w:rPr>
+          <w:rFonts w:ascii="Arial" w:hAnsi="Arial" w:cs="Arial"/>
+        </w:rPr>
+        <w:t xml:space="preserve"> Beyond the core architecture, Bob was utilized to accelerate full-stack refinement. This included aligning the Vite/React dashboard UI with the IBM Bob IDE design language, managing local SQLite database migrations for persistent telemetry, and executing surgical debugging across the Express routing and client layers to ensure a stable, production-ready prototype.</w:t>
       </w:r>
     </w:p>
     <w:p>
       <w:pPr>
-        <w:pStyle w:val="Heading2"/>
-        <w:spacing w:line="276" w:lineRule="auto"/>
-        <w:rPr>
-          <w:rFonts w:ascii="Arial" w:hAnsi="Arial" w:cs="Arial"/>
-        </w:rPr>
-      </w:pPr>
-      <w:r>
-        <w:rPr>
-          <w:rFonts w:ascii="Arial" w:hAnsi="Arial" w:cs="Arial"/>
-        </w:rPr>
-        <w:t>How IBM Bob 2.0 Powered Po-Ko</w:t>
-      </w:r>
-    </w:p>
-    <w:p>
-      <w:pPr>
-        <w:spacing w:line="276" w:lineRule="auto"/>
-        <w:rPr>
-          <w:rFonts w:ascii="Arial" w:hAnsi="Arial" w:cs="Arial"/>
-        </w:rPr>
-      </w:pPr>
-      <w:r>
-        <w:rPr>
-          <w:rFonts w:ascii="Arial" w:hAnsi="Arial" w:cs="Arial"/>
-        </w:rPr>
-        <w:t>Operating under the strict 40-Bobcoin limit, we deployed IBM Bob IDE exclusively as a high-level software architect. We utilized Bob 2.0’s core capabilities to build the complex components of our predictive framework, generating the logic against our sanitized, 191-day local dataset.</w:t>
-      </w:r>
-    </w:p>
-    <w:p>
-      <w:pPr>
-        <w:spacing w:line="276" w:lineRule="auto"/>
-        <w:rPr>
-          <w:rFonts w:ascii="Arial" w:hAnsi="Arial" w:cs="Arial"/>
-        </w:rPr>
-      </w:pPr>
-    </w:p>
-    <w:p>
-      <w:pPr>
-        <w:pStyle w:val="Heading2"/>
-        <w:spacing w:line="276" w:lineRule="auto"/>
-        <w:rPr>
-          <w:rFonts w:ascii="Arial" w:hAnsi="Arial" w:cs="Arial"/>
-        </w:rPr>
-      </w:pPr>
-      <w:r>
-        <w:rPr>
-          <w:rFonts w:ascii="Arial" w:hAnsi="Arial" w:cs="Arial"/>
-        </w:rPr>
-        <w:t>1. Agent Mode (The Telemetry Subagent)</w:t>
-      </w:r>
-    </w:p>
-    <w:p>
-      <w:pPr>
-        <w:spacing w:line="276" w:lineRule="auto"/>
-        <w:rPr>
-          <w:rFonts w:ascii="Arial" w:hAnsi="Arial" w:cs="Arial"/>
-        </w:rPr>
-      </w:pPr>
-      <w:r>
-        <w:rPr>
-          <w:rFonts w:ascii="Arial" w:hAnsi="Arial" w:cs="Arial"/>
-        </w:rPr>
-        <w:t>We used Bob IDE to architect the local predictive engine. Bob generated the Node.js logic that ingests our historical mock telemetry dataset and calculates the daily 1</w:t>
-      </w:r>
-      <w:r>
-        <w:rPr>
-          <w:rFonts w:ascii="Arial" w:hAnsi="Arial" w:cs="Arial"/>
-        </w:rPr>
-        <w:t>-</w:t>
-      </w:r>
-      <w:r>
-        <w:rPr>
-          <w:rFonts w:ascii="Arial" w:hAnsi="Arial" w:cs="Arial"/>
-        </w:rPr>
-        <w:t>10 Po</w:t>
-      </w:r>
-      <w:r>
-        <w:rPr>
-          <w:rFonts w:ascii="Arial" w:hAnsi="Arial" w:cs="Arial"/>
-        </w:rPr>
-        <w:t>-</w:t>
-      </w:r>
-      <w:r>
-        <w:rPr>
-          <w:rFonts w:ascii="Arial" w:hAnsi="Arial" w:cs="Arial"/>
-        </w:rPr>
-        <w:t>Ko Score. Crucially, Bob helped us implement the continuous learning loop, allowing the agent to establish a personalized baseline over time based on historical data and user micro-surveys.</w:t>
-      </w:r>
-    </w:p>
-    <w:p>
-      <w:pPr>
-        <w:spacing w:line="276" w:lineRule="auto"/>
-        <w:rPr>
-          <w:rFonts w:ascii="Arial" w:hAnsi="Arial" w:cs="Arial"/>
-        </w:rPr>
-      </w:pPr>
-    </w:p>
-    <w:p>
-      <w:pPr>
-        <w:pStyle w:val="Heading2"/>
-        <w:spacing w:line="276" w:lineRule="auto"/>
-        <w:rPr>
-          <w:rFonts w:ascii="Arial" w:hAnsi="Arial" w:cs="Arial"/>
-        </w:rPr>
-      </w:pPr>
-      <w:r>
-        <w:rPr>
-          <w:rFonts w:ascii="Arial" w:hAnsi="Arial" w:cs="Arial"/>
-        </w:rPr>
-        <w:t>2. Document Understanding (The Context Subagent)</w:t>
-      </w:r>
-    </w:p>
-    <w:p>
-      <w:pPr>
-        <w:spacing w:line="276" w:lineRule="auto"/>
-        <w:rPr>
-          <w:rFonts w:ascii="Arial" w:hAnsi="Arial" w:cs="Arial"/>
-        </w:rPr>
-      </w:pPr>
-      <w:r>
-        <w:rPr>
-          <w:rFonts w:ascii="Arial" w:hAnsi="Arial" w:cs="Arial"/>
-        </w:rPr>
-        <w:t>We leveraged Bob 2.0’s Document Understanding to build our "Code Guardian" feature. Bob wrote the script that scans GitHub PR descriptions and codebase structures to classify upcoming tasks by cognitive weight. If the developer's Po-Ko score triggers an "Active Support State," Bob’s logic automatically applies a metadata flag to their pushed code. The primary benefit here is traceability: the flagged code is stored with health-state context. When bugs arise later, developers have a highlighted starting point where they know there is a significantly higher probability of fatigue-induced faults.</w:t>
-      </w:r>
-    </w:p>
-    <w:p>
-      <w:pPr>
-        <w:spacing w:line="276" w:lineRule="auto"/>
-        <w:rPr>
-          <w:rFonts w:ascii="Arial" w:hAnsi="Arial" w:cs="Arial"/>
-        </w:rPr>
-      </w:pPr>
-    </w:p>
-    <w:p>
-      <w:pPr>
-        <w:pStyle w:val="Heading2"/>
-        <w:spacing w:line="276" w:lineRule="auto"/>
-        <w:rPr>
-          <w:rFonts w:ascii="Arial" w:hAnsi="Arial" w:cs="Arial"/>
-        </w:rPr>
-      </w:pPr>
-      <w:r>
-        <w:rPr>
-          <w:rFonts w:ascii="Arial" w:hAnsi="Arial" w:cs="Arial"/>
-        </w:rPr>
-        <w:t>3. Parallel Tasks (The Workflow Interceptor)</w:t>
-      </w:r>
-    </w:p>
-    <w:p>
-      <w:pPr>
-        <w:spacing w:line="276" w:lineRule="auto"/>
-        <w:rPr>
-          <w:rFonts w:ascii="Arial" w:hAnsi="Arial" w:cs="Arial"/>
-        </w:rPr>
-      </w:pPr>
-      <w:r>
-        <w:rPr>
-          <w:rFonts w:ascii="Arial" w:hAnsi="Arial" w:cs="Arial"/>
-        </w:rPr>
-        <w:t>To create seamless interventions, we used Bob to script the local Model Context Protocol (MCP) server integration. Bob built the parallel execution workflows: when the risk threshold is breached, the system simultaneously triggers OS-native modals advising hydration and medication, while executing asynchronous API calls to GitHub to temporarily unassign the developer from critical code reviews.</w:t>
-      </w:r>
-    </w:p>
-    <w:p>
-      <w:pPr>
-        <w:spacing w:line="276" w:lineRule="auto"/>
-        <w:rPr>
-          <w:rFonts w:ascii="Arial" w:hAnsi="Arial" w:cs="Arial"/>
-        </w:rPr>
-      </w:pPr>
-      <w:r>
-        <w:rPr>
-          <w:rFonts w:ascii="Arial" w:hAnsi="Arial" w:cs="Arial"/>
-        </w:rPr>
-        <w:t>All architectural generation was executed within the Bob IDE, and session consumption summaries were captured for every task. The scripts were then run entirely locally using our Node.js server, ensuring zero exposure of private health telemetry.</w:t>
-      </w:r>
+        <w:spacing w:after="100" w:afterAutospacing="1" w:line="240" w:lineRule="auto"/>
+        <w:outlineLvl w:val="1"/>
+        <w:rPr>
+          <w:rFonts w:ascii="Arial" w:hAnsi="Arial" w:cs="Arial"/>
+        </w:rPr>
+      </w:pPr>
     </w:p>
     <w:sectPr>
       <w:pgSz w:w="11906" w:h="16838"/>
@@ -507,6 +751,315 @@
     </w:sectPr>
   </w:body>
 </w:document>
+</file>
+
+<file path=word/numbering.xml><?xml version="1.0" encoding="utf-8"?>
+<w:numbering xmlns:wpc="http://schemas.microsoft.com/office/word/2010/wordprocessingCanvas" xmlns:cx="http://schemas.microsoft.com/office/drawing/2014/chartex" xmlns:cx1="http://schemas.microsoft.com/office/drawing/2015/9/8/chartex" xmlns:cx2="http://schemas.microsoft.com/office/drawing/2015/10/21/chartex" xmlns:cx3="http://schemas.microsoft.com/office/drawing/2016/5/9/chartex" xmlns:cx4="http://schemas.microsoft.com/office/drawing/2016/5/10/chartex" xmlns:cx5="http://schemas.microsoft.com/office/drawing/2016/5/11/chartex" xmlns:cx6="http://schemas.microsoft.com/office/drawing/2016/5/12/chartex" xmlns:cx7="http://schemas.microsoft.com/office/drawing/2016/5/13/chartex" xmlns:cx8="http://schemas.microsoft.com/office/drawing/2016/5/14/chartex" xmlns:mc="http://schemas.openxmlformats.org/markup-compatibility/2006" xmlns:aink="http://schemas.microsoft.com/office/drawing/2016/ink" xmlns:am3d="http://schemas.microsoft.com/office/drawing/2017/model3d" xmlns:o="urn:schemas-microsoft-com:office:office" xmlns:oel="http://schemas.microsoft.com/office/2019/extlst" xmlns:r="http://schemas.openxmlformats.org/officeDocument/2006/relationships" xmlns:m="http://schemas.openxmlformats.org/officeDocument/2006/math" xmlns:v="urn:schemas-microsoft-com:vml" xmlns:wp14="http://schemas.microsoft.com/office/word/2010/wordprocessingDrawing" xmlns:wp="http://schemas.openxmlformats.org/drawingml/2006/wordprocessingDrawing" xmlns:w10="urn:schemas-microsoft-com:office:word" xmlns:w="http://schemas.openxmlformats.org/wordprocessingml/2006/main" xmlns:w14="http://schemas.microsoft.com/office/word/2010/wordml" xmlns:w15="http://schemas.microsoft.com/office/word/2012/wordml" xmlns:w16cex="http://schemas.microsoft.com/office/word/2018/wordml/cex" xmlns:w16cid="http://schemas.microsoft.com/office/word/2016/wordml/cid" xmlns:w16="http://schemas.microsoft.com/office/word/2018/wordml" xmlns:w16du="http://schemas.microsoft.com/office/word/2023/wordml/word16du" xmlns:w16sdtdh="http://schemas.microsoft.com/office/word/2020/wordml/sdtdatahash" xmlns:w16sdtfl="http://schemas.microsoft.com/office/word/2024/wordml/sdtformatlock" xmlns:w16se="http://schemas.microsoft.com/office/word/2015/wordml/symex" xmlns:wpg="http://schemas.microsoft.com/office/word/2010/wordprocessingGroup" xmlns:wpi="http://schemas.microsoft.com/office/word/2010/wordprocessingInk" xmlns:wne="http://schemas.microsoft.com/office/word/2006/wordml" xmlns:wps="http://schemas.microsoft.com/office/word/2010/wordprocessingShape" mc:Ignorable="w14 w15 w16se w16cid w16 w16cex w16sdtdh w16sdtfl w16du wp14">
+  <w:abstractNum w:abstractNumId="0" w15:restartNumberingAfterBreak="0">
+    <w:nsid w:val="14332E17"/>
+    <w:multiLevelType w:val="multilevel"/>
+    <w:tmpl w:val="A96ABD14"/>
+    <w:lvl w:ilvl="0">
+      <w:start w:val="1"/>
+      <w:numFmt w:val="bullet"/>
+      <w:lvlText w:val=""/>
+      <w:lvlJc w:val="left"/>
+      <w:pPr>
+        <w:tabs>
+          <w:tab w:val="num" w:pos="720"/>
+        </w:tabs>
+        <w:ind w:left="720" w:hanging="360"/>
+      </w:pPr>
+      <w:rPr>
+        <w:rFonts w:ascii="Symbol" w:hAnsi="Symbol" w:hint="default"/>
+        <w:sz w:val="20"/>
+      </w:rPr>
+    </w:lvl>
+    <w:lvl w:ilvl="1" w:tentative="1">
+      <w:start w:val="1"/>
+      <w:numFmt w:val="bullet"/>
+      <w:lvlText w:val="o"/>
+      <w:lvlJc w:val="left"/>
+      <w:pPr>
+        <w:tabs>
+          <w:tab w:val="num" w:pos="1440"/>
+        </w:tabs>
+        <w:ind w:left="1440" w:hanging="360"/>
+      </w:pPr>
+      <w:rPr>
+        <w:rFonts w:ascii="Courier New" w:hAnsi="Courier New" w:hint="default"/>
+        <w:sz w:val="20"/>
+      </w:rPr>
+    </w:lvl>
+    <w:lvl w:ilvl="2" w:tentative="1">
+      <w:start w:val="1"/>
+      <w:numFmt w:val="bullet"/>
+      <w:lvlText w:val=""/>
+      <w:lvlJc w:val="left"/>
+      <w:pPr>
+        <w:tabs>
+          <w:tab w:val="num" w:pos="2160"/>
+        </w:tabs>
+        <w:ind w:left="2160" w:hanging="360"/>
+      </w:pPr>
+      <w:rPr>
+        <w:rFonts w:ascii="Wingdings" w:hAnsi="Wingdings" w:hint="default"/>
+        <w:sz w:val="20"/>
+      </w:rPr>
+    </w:lvl>
+    <w:lvl w:ilvl="3" w:tentative="1">
+      <w:start w:val="1"/>
+      <w:numFmt w:val="bullet"/>
+      <w:lvlText w:val=""/>
+      <w:lvlJc w:val="left"/>
+      <w:pPr>
+        <w:tabs>
+          <w:tab w:val="num" w:pos="2880"/>
+        </w:tabs>
+        <w:ind w:left="2880" w:hanging="360"/>
+      </w:pPr>
+      <w:rPr>
+        <w:rFonts w:ascii="Wingdings" w:hAnsi="Wingdings" w:hint="default"/>
+        <w:sz w:val="20"/>
+      </w:rPr>
+    </w:lvl>
+    <w:lvl w:ilvl="4" w:tentative="1">
+      <w:start w:val="1"/>
+      <w:numFmt w:val="bullet"/>
+      <w:lvlText w:val=""/>
+      <w:lvlJc w:val="left"/>
+      <w:pPr>
+        <w:tabs>
+          <w:tab w:val="num" w:pos="3600"/>
+        </w:tabs>
+        <w:ind w:left="3600" w:hanging="360"/>
+      </w:pPr>
+      <w:rPr>
+        <w:rFonts w:ascii="Wingdings" w:hAnsi="Wingdings" w:hint="default"/>
+        <w:sz w:val="20"/>
+      </w:rPr>
+    </w:lvl>
+    <w:lvl w:ilvl="5" w:tentative="1">
+      <w:start w:val="1"/>
+      <w:numFmt w:val="bullet"/>
+      <w:lvlText w:val=""/>
+      <w:lvlJc w:val="left"/>
+      <w:pPr>
+        <w:tabs>
+          <w:tab w:val="num" w:pos="4320"/>
+        </w:tabs>
+        <w:ind w:left="4320" w:hanging="360"/>
+      </w:pPr>
+      <w:rPr>
+        <w:rFonts w:ascii="Wingdings" w:hAnsi="Wingdings" w:hint="default"/>
+        <w:sz w:val="20"/>
+      </w:rPr>
+    </w:lvl>
+    <w:lvl w:ilvl="6" w:tentative="1">
+      <w:start w:val="1"/>
+      <w:numFmt w:val="bullet"/>
+      <w:lvlText w:val=""/>
+      <w:lvlJc w:val="left"/>
+      <w:pPr>
+        <w:tabs>
+          <w:tab w:val="num" w:pos="5040"/>
+        </w:tabs>
+        <w:ind w:left="5040" w:hanging="360"/>
+      </w:pPr>
+      <w:rPr>
+        <w:rFonts w:ascii="Wingdings" w:hAnsi="Wingdings" w:hint="default"/>
+        <w:sz w:val="20"/>
+      </w:rPr>
+    </w:lvl>
+    <w:lvl w:ilvl="7" w:tentative="1">
+      <w:start w:val="1"/>
+      <w:numFmt w:val="bullet"/>
+      <w:lvlText w:val=""/>
+      <w:lvlJc w:val="left"/>
+      <w:pPr>
+        <w:tabs>
+          <w:tab w:val="num" w:pos="5760"/>
+        </w:tabs>
+        <w:ind w:left="5760" w:hanging="360"/>
+      </w:pPr>
+      <w:rPr>
+        <w:rFonts w:ascii="Wingdings" w:hAnsi="Wingdings" w:hint="default"/>
+        <w:sz w:val="20"/>
+      </w:rPr>
+    </w:lvl>
+    <w:lvl w:ilvl="8" w:tentative="1">
+      <w:start w:val="1"/>
+      <w:numFmt w:val="bullet"/>
+      <w:lvlText w:val=""/>
+      <w:lvlJc w:val="left"/>
+      <w:pPr>
+        <w:tabs>
+          <w:tab w:val="num" w:pos="6480"/>
+        </w:tabs>
+        <w:ind w:left="6480" w:hanging="360"/>
+      </w:pPr>
+      <w:rPr>
+        <w:rFonts w:ascii="Wingdings" w:hAnsi="Wingdings" w:hint="default"/>
+        <w:sz w:val="20"/>
+      </w:rPr>
+    </w:lvl>
+  </w:abstractNum>
+  <w:abstractNum w:abstractNumId="1" w15:restartNumberingAfterBreak="0">
+    <w:nsid w:val="1A572C5C"/>
+    <w:multiLevelType w:val="multilevel"/>
+    <w:tmpl w:val="0F46543C"/>
+    <w:lvl w:ilvl="0">
+      <w:start w:val="1"/>
+      <w:numFmt w:val="bullet"/>
+      <w:lvlText w:val=""/>
+      <w:lvlJc w:val="left"/>
+      <w:pPr>
+        <w:tabs>
+          <w:tab w:val="num" w:pos="720"/>
+        </w:tabs>
+        <w:ind w:left="720" w:hanging="360"/>
+      </w:pPr>
+      <w:rPr>
+        <w:rFonts w:ascii="Symbol" w:hAnsi="Symbol" w:hint="default"/>
+        <w:sz w:val="20"/>
+      </w:rPr>
+    </w:lvl>
+    <w:lvl w:ilvl="1" w:tentative="1">
+      <w:start w:val="1"/>
+      <w:numFmt w:val="bullet"/>
+      <w:lvlText w:val="o"/>
+      <w:lvlJc w:val="left"/>
+      <w:pPr>
+        <w:tabs>
+          <w:tab w:val="num" w:pos="1440"/>
+        </w:tabs>
+        <w:ind w:left="1440" w:hanging="360"/>
+      </w:pPr>
+      <w:rPr>
+        <w:rFonts w:ascii="Courier New" w:hAnsi="Courier New" w:hint="default"/>
+        <w:sz w:val="20"/>
+      </w:rPr>
+    </w:lvl>
+    <w:lvl w:ilvl="2" w:tentative="1">
+      <w:start w:val="1"/>
+      <w:numFmt w:val="bullet"/>
+      <w:lvlText w:val=""/>
+      <w:lvlJc w:val="left"/>
+      <w:pPr>
+        <w:tabs>
+          <w:tab w:val="num" w:pos="2160"/>
+        </w:tabs>
+        <w:ind w:left="2160" w:hanging="360"/>
+      </w:pPr>
+      <w:rPr>
+        <w:rFonts w:ascii="Wingdings" w:hAnsi="Wingdings" w:hint="default"/>
+        <w:sz w:val="20"/>
+      </w:rPr>
+    </w:lvl>
+    <w:lvl w:ilvl="3" w:tentative="1">
+      <w:start w:val="1"/>
+      <w:numFmt w:val="bullet"/>
+      <w:lvlText w:val=""/>
+      <w:lvlJc w:val="left"/>
+      <w:pPr>
+        <w:tabs>
+          <w:tab w:val="num" w:pos="2880"/>
+        </w:tabs>
+        <w:ind w:left="2880" w:hanging="360"/>
+      </w:pPr>
+      <w:rPr>
+        <w:rFonts w:ascii="Wingdings" w:hAnsi="Wingdings" w:hint="default"/>
+        <w:sz w:val="20"/>
+      </w:rPr>
+    </w:lvl>
+    <w:lvl w:ilvl="4" w:tentative="1">
+      <w:start w:val="1"/>
+      <w:numFmt w:val="bullet"/>
+      <w:lvlText w:val=""/>
+      <w:lvlJc w:val="left"/>
+      <w:pPr>
+        <w:tabs>
+          <w:tab w:val="num" w:pos="3600"/>
+        </w:tabs>
+        <w:ind w:left="3600" w:hanging="360"/>
+      </w:pPr>
+      <w:rPr>
+        <w:rFonts w:ascii="Wingdings" w:hAnsi="Wingdings" w:hint="default"/>
+        <w:sz w:val="20"/>
+      </w:rPr>
+    </w:lvl>
+    <w:lvl w:ilvl="5" w:tentative="1">
+      <w:start w:val="1"/>
+      <w:numFmt w:val="bullet"/>
+      <w:lvlText w:val=""/>
+      <w:lvlJc w:val="left"/>
+      <w:pPr>
+        <w:tabs>
+          <w:tab w:val="num" w:pos="4320"/>
+        </w:tabs>
+        <w:ind w:left="4320" w:hanging="360"/>
+      </w:pPr>
+      <w:rPr>
+        <w:rFonts w:ascii="Wingdings" w:hAnsi="Wingdings" w:hint="default"/>
+        <w:sz w:val="20"/>
+      </w:rPr>
+    </w:lvl>
+    <w:lvl w:ilvl="6" w:tentative="1">
+      <w:start w:val="1"/>
+      <w:numFmt w:val="bullet"/>
+      <w:lvlText w:val=""/>
+      <w:lvlJc w:val="left"/>
+      <w:pPr>
+        <w:tabs>
+          <w:tab w:val="num" w:pos="5040"/>
+        </w:tabs>
+        <w:ind w:left="5040" w:hanging="360"/>
+      </w:pPr>
+      <w:rPr>
+        <w:rFonts w:ascii="Wingdings" w:hAnsi="Wingdings" w:hint="default"/>
+        <w:sz w:val="20"/>
+      </w:rPr>
+    </w:lvl>
+    <w:lvl w:ilvl="7" w:tentative="1">
+      <w:start w:val="1"/>
+      <w:numFmt w:val="bullet"/>
+      <w:lvlText w:val=""/>
+      <w:lvlJc w:val="left"/>
+      <w:pPr>
+        <w:tabs>
+          <w:tab w:val="num" w:pos="5760"/>
+        </w:tabs>
+        <w:ind w:left="5760" w:hanging="360"/>
+      </w:pPr>
+      <w:rPr>
+        <w:rFonts w:ascii="Wingdings" w:hAnsi="Wingdings" w:hint="default"/>
+        <w:sz w:val="20"/>
+      </w:rPr>
+    </w:lvl>
+    <w:lvl w:ilvl="8" w:tentative="1">
+      <w:start w:val="1"/>
+      <w:numFmt w:val="bullet"/>
+      <w:lvlText w:val=""/>
+      <w:lvlJc w:val="left"/>
+      <w:pPr>
+        <w:tabs>
+          <w:tab w:val="num" w:pos="6480"/>
+        </w:tabs>
+        <w:ind w:left="6480" w:hanging="360"/>
+      </w:pPr>
+      <w:rPr>
+        <w:rFonts w:ascii="Wingdings" w:hAnsi="Wingdings" w:hint="default"/>
+        <w:sz w:val="20"/>
+      </w:rPr>
+    </w:lvl>
+  </w:abstractNum>
+  <w:num w:numId="1" w16cid:durableId="203252402">
+    <w:abstractNumId w:val="1"/>
+  </w:num>
+  <w:num w:numId="2" w16cid:durableId="603850936">
+    <w:abstractNumId w:val="0"/>
+  </w:num>
+</w:numbering>
 </file>
 
 <file path=word/styles.xml><?xml version="1.0" encoding="utf-8"?>
@@ -1423,6 +1976,37 @@
       <w:spacing w:val="5"/>
     </w:rPr>
   </w:style>
+  <w:style w:type="paragraph" w:styleId="NormalWeb">
+    <w:name w:val="Normal (Web)"/>
+    <w:basedOn w:val="Normal"/>
+    <w:uiPriority w:val="99"/>
+    <w:semiHidden/>
+    <w:unhideWhenUsed/>
+    <w:rsid w:val="00622367"/>
+    <w:pPr>
+      <w:spacing w:before="100" w:beforeAutospacing="1" w:after="100" w:afterAutospacing="1" w:line="240" w:lineRule="auto"/>
+    </w:pPr>
+    <w:rPr>
+      <w:rFonts w:eastAsia="Times New Roman"/>
+      <w:sz w:val="24"/>
+      <w:szCs w:val="24"/>
+      <w:lang w:eastAsia="en-GB"/>
+      <w14:ligatures w14:val="none"/>
+    </w:rPr>
+  </w:style>
+  <w:style w:type="character" w:styleId="HTMLCode">
+    <w:name w:val="HTML Code"/>
+    <w:basedOn w:val="DefaultParagraphFont"/>
+    <w:uiPriority w:val="99"/>
+    <w:semiHidden/>
+    <w:unhideWhenUsed/>
+    <w:rsid w:val="00622367"/>
+    <w:rPr>
+      <w:rFonts w:ascii="Courier New" w:eastAsia="Times New Roman" w:hAnsi="Courier New" w:cs="Courier New"/>
+      <w:sz w:val="20"/>
+      <w:szCs w:val="20"/>
+    </w:rPr>
+  </w:style>
 </w:styles>
 </file>
 

</xml_diff>

<commit_message>
Implement Husky to execute hook for codeGuardian
</commit_message>
<xml_diff>
--- a/Basic Information/Po-Ko Project.docx
+++ b/Basic Information/Po-Ko Project.docx
@@ -4,745 +4,298 @@
   <w:body>
     <w:p>
       <w:pPr>
-        <w:spacing w:after="100" w:afterAutospacing="1" w:line="240" w:lineRule="auto"/>
-        <w:outlineLvl w:val="1"/>
+        <w:pStyle w:val="Heading1"/>
+      </w:pPr>
+      <w:r>
+        <w:t>Project Title</w:t>
+      </w:r>
+    </w:p>
+    <w:p>
+      <w:r>
+        <w:t>Po-Ko: The Predictive Developer Capacity Framework</w:t>
+      </w:r>
+    </w:p>
+    <w:p>
+      <w:pPr>
+        <w:pStyle w:val="Heading1"/>
+      </w:pPr>
+      <w:r>
+        <w:t>Short Description</w:t>
+      </w:r>
+    </w:p>
+    <w:p>
+      <w:r>
+        <w:t xml:space="preserve">Po-Ko is an AI-powered developer capacity framework that runs as a local Model Context Protocol (MCP) server, integrating seamlessly into the IBM Bob IDE. Acting as a proactive daily caretaker, Po-Ko fuses wearable telemetry with a continuous machine learning engine to deliver time-specific health advice, predict fatigue, and shield developers from cognitive burnout without ever leaving their workspace. </w:t>
+      </w:r>
+    </w:p>
+    <w:p>
+      <w:pPr>
+        <w:pStyle w:val="Heading1"/>
+      </w:pPr>
+      <w:r>
+        <w:t>Technology &amp; Category Tags</w:t>
+      </w:r>
+    </w:p>
+    <w:p>
+      <w:r>
+        <w:t xml:space="preserve">AI Assistant, Developer Tools, Health &amp; Wellness, Node.js, React, Vite, SQLite, Model Context Protocol (MCP), Predictive Analytics, Automation. </w:t>
+      </w:r>
+    </w:p>
+    <w:p>
+      <w:pPr>
+        <w:pStyle w:val="Heading1"/>
+      </w:pPr>
+      <w:r>
+        <w:t>Long Description (Problem &amp; Solution Statement)</w:t>
+      </w:r>
+    </w:p>
+    <w:p>
+      <w:r>
+        <w:t xml:space="preserve">The Problem The software engineering industry operates on the flawed assumption of infinite human capacity. Severe fatigue and human biological interruptions are massive disruptors to developer workflows. When a developer is fighting off an illness or is severely exhausted, cognitive function drops: code review quality plummets, syntax errors compound, and critical deployments are put at risk. Current market solutions only warn users about physical vulnerability, leaving developers to manage their complex workloads entirely on their own. </w:t>
+      </w:r>
+    </w:p>
+    <w:p>
+      <w:r>
+        <w:t>The Solution Po-Ko</w:t>
+      </w:r>
+      <w:r>
+        <w:t xml:space="preserve">, </w:t>
+      </w:r>
+      <w:r>
+        <w:t xml:space="preserve">derived from the ancient Greek word </w:t>
+      </w:r>
+      <w:proofErr w:type="spellStart"/>
+      <w:r>
+        <w:t>ptōchos</w:t>
+      </w:r>
+      <w:proofErr w:type="spellEnd"/>
+      <w:r>
+        <w:t>, symbolizing the strength in acknowledging our limitations and our daily need for support</w:t>
+      </w:r>
+      <w:r>
+        <w:t xml:space="preserve">, </w:t>
+      </w:r>
+      <w:r>
+        <w:t xml:space="preserve">is a proactive developer capacity framework. It functions as a daily caretaker, utilizing a dynamic Po-Ko Scoring Algorithm (1–10) that fuses internal biometric vulnerability (Garmin Overnight HRV, Sleep Score, and Stress) with external exposure data gathered via intelligent micro-surveys. </w:t>
+      </w:r>
+    </w:p>
+    <w:p>
+      <w:r>
+        <w:t xml:space="preserve">Target Users &amp; Interaction Designed for software engineers, Po-Ko makes the IBM Bob IDE its primary interaction surface. Through a custom Model Context Protocol (MCP) server, developers can interact directly with IBM Bob in their chat window to check their real-time Po-Ko capacity score, log daily metrics, report lifestyle context (external factors), and receive time-specific contextual health advice (morning, midday, afternoon). A comprehensive Vite/React web dashboard serves as a secondary full-view screen, offering detailed score breakdowns, explainability tooltips, and a 30-day recovery trend chart. </w:t>
+      </w:r>
+    </w:p>
+    <w:p>
+      <w:pPr>
+        <w:pStyle w:val="Heading1"/>
+      </w:pPr>
+      <w:r>
+        <w:t>Why It Is Creative &amp; Unique</w:t>
+      </w:r>
+    </w:p>
+    <w:p>
+      <w:r>
+        <w:t>Po-Ko addresses developer burnout in entirely new ways:</w:t>
+      </w:r>
+    </w:p>
+    <w:p>
+      <w:r>
         <w:rPr>
-          <w:rFonts w:ascii="Arial" w:eastAsia="Times New Roman" w:hAnsi="Arial" w:cs="Arial"/>
-          <w:b/>
-          <w:bCs/>
-          <w:sz w:val="36"/>
-          <w:szCs w:val="36"/>
-          <w:lang w:eastAsia="en-GB"/>
-          <w14:ligatures w14:val="none"/>
-        </w:rPr>
-      </w:pPr>
-      <w:r>
-        <w:rPr>
-          <w:rFonts w:ascii="Arial" w:eastAsia="Times New Roman" w:hAnsi="Arial" w:cs="Arial"/>
-          <w:b/>
-          <w:bCs/>
-          <w:sz w:val="36"/>
-          <w:szCs w:val="36"/>
-          <w:lang w:eastAsia="en-GB"/>
-          <w14:ligatures w14:val="none"/>
-        </w:rPr>
-        <w:t>Project Title</w:t>
-      </w:r>
-    </w:p>
-    <w:p>
-      <w:pPr>
-        <w:spacing w:after="100" w:afterAutospacing="1" w:line="240" w:lineRule="auto"/>
-        <w:rPr>
-          <w:rFonts w:ascii="Arial" w:eastAsia="Times New Roman" w:hAnsi="Arial" w:cs="Arial"/>
-          <w:sz w:val="24"/>
-          <w:szCs w:val="24"/>
-          <w:lang w:eastAsia="en-GB"/>
-          <w14:ligatures w14:val="none"/>
-        </w:rPr>
-      </w:pPr>
-      <w:r>
-        <w:rPr>
-          <w:rFonts w:ascii="Arial" w:eastAsia="Times New Roman" w:hAnsi="Arial" w:cs="Arial"/>
-          <w:b/>
-          <w:bCs/>
-          <w:sz w:val="24"/>
-          <w:szCs w:val="24"/>
-          <w:lang w:eastAsia="en-GB"/>
-          <w14:ligatures w14:val="none"/>
-        </w:rPr>
-        <w:t>Po-Ko: The Predictive Developer Capacity Framework</w:t>
-      </w:r>
-    </w:p>
-    <w:p>
-      <w:pPr>
-        <w:spacing w:after="100" w:afterAutospacing="1" w:line="240" w:lineRule="auto"/>
-        <w:outlineLvl w:val="1"/>
-        <w:rPr>
-          <w:rFonts w:ascii="Arial" w:eastAsia="Times New Roman" w:hAnsi="Arial" w:cs="Arial"/>
-          <w:b/>
-          <w:bCs/>
-          <w:sz w:val="36"/>
-          <w:szCs w:val="36"/>
-          <w:lang w:eastAsia="en-GB"/>
-          <w14:ligatures w14:val="none"/>
-        </w:rPr>
-      </w:pPr>
-      <w:r>
-        <w:rPr>
-          <w:rFonts w:ascii="Arial" w:eastAsia="Times New Roman" w:hAnsi="Arial" w:cs="Arial"/>
-          <w:b/>
-          <w:bCs/>
-          <w:sz w:val="36"/>
-          <w:szCs w:val="36"/>
-          <w:lang w:eastAsia="en-GB"/>
-          <w14:ligatures w14:val="none"/>
-        </w:rPr>
-        <w:t>Short Description</w:t>
-      </w:r>
-    </w:p>
-    <w:p>
-      <w:pPr>
-        <w:spacing w:after="100" w:afterAutospacing="1" w:line="240" w:lineRule="auto"/>
-        <w:rPr>
-          <w:rFonts w:ascii="Arial" w:eastAsia="Times New Roman" w:hAnsi="Arial" w:cs="Arial"/>
-          <w:sz w:val="24"/>
-          <w:szCs w:val="24"/>
-          <w:lang w:eastAsia="en-GB"/>
-          <w14:ligatures w14:val="none"/>
-        </w:rPr>
-      </w:pPr>
-      <w:r>
-        <w:rPr>
-          <w:rFonts w:ascii="Arial" w:eastAsia="Times New Roman" w:hAnsi="Arial" w:cs="Arial"/>
-          <w:sz w:val="24"/>
-          <w:szCs w:val="24"/>
-          <w:lang w:eastAsia="en-GB"/>
-          <w14:ligatures w14:val="none"/>
-        </w:rPr>
-        <w:t xml:space="preserve">Po-Ko is an AI-powered developer capacity framework that runs as a local Model Context Protocol (MCP) server, integrating seamlessly into the IBM Bob IDE. Acting as a proactive daily caretaker, Po-Ko fuses wearable telemetry with a continuous machine learning engine to deliver time-specific health advice, predict fatigue, and shield developers from cognitive burnout without ever leaving their workspace. </w:t>
-      </w:r>
-    </w:p>
-    <w:p>
-      <w:pPr>
-        <w:spacing w:after="100" w:afterAutospacing="1" w:line="240" w:lineRule="auto"/>
-        <w:outlineLvl w:val="1"/>
-        <w:rPr>
-          <w:rFonts w:ascii="Arial" w:eastAsia="Times New Roman" w:hAnsi="Arial" w:cs="Arial"/>
-          <w:b/>
-          <w:bCs/>
-          <w:sz w:val="36"/>
-          <w:szCs w:val="36"/>
-          <w:lang w:eastAsia="en-GB"/>
-          <w14:ligatures w14:val="none"/>
-        </w:rPr>
-      </w:pPr>
-      <w:r>
-        <w:rPr>
-          <w:rFonts w:ascii="Arial" w:eastAsia="Times New Roman" w:hAnsi="Arial" w:cs="Arial"/>
-          <w:b/>
-          <w:bCs/>
-          <w:sz w:val="36"/>
-          <w:szCs w:val="36"/>
-          <w:lang w:eastAsia="en-GB"/>
-          <w14:ligatures w14:val="none"/>
-        </w:rPr>
-        <w:t>Technology &amp; Category Tags</w:t>
-      </w:r>
-    </w:p>
-    <w:p>
-      <w:pPr>
-        <w:spacing w:after="100" w:afterAutospacing="1" w:line="240" w:lineRule="auto"/>
-        <w:rPr>
-          <w:rFonts w:ascii="Arial" w:eastAsia="Times New Roman" w:hAnsi="Arial" w:cs="Arial"/>
-          <w:sz w:val="24"/>
-          <w:szCs w:val="24"/>
-          <w:lang w:eastAsia="en-GB"/>
-          <w14:ligatures w14:val="none"/>
-        </w:rPr>
-      </w:pPr>
-      <w:r>
-        <w:rPr>
-          <w:rFonts w:ascii="Arial" w:eastAsia="Times New Roman" w:hAnsi="Arial" w:cs="Arial"/>
-          <w:sz w:val="24"/>
-          <w:szCs w:val="24"/>
-          <w:lang w:eastAsia="en-GB"/>
-          <w14:ligatures w14:val="none"/>
-        </w:rPr>
-        <w:t xml:space="preserve">AI Assistant, Developer Tools, Health &amp; Wellness, Node.js, React, Vite, SQLite, Model Context Protocol (MCP), Predictive Analytics, Automation. </w:t>
-      </w:r>
-    </w:p>
-    <w:p>
-      <w:pPr>
-        <w:spacing w:after="100" w:afterAutospacing="1" w:line="240" w:lineRule="auto"/>
-        <w:outlineLvl w:val="1"/>
-        <w:rPr>
-          <w:rFonts w:ascii="Arial" w:eastAsia="Times New Roman" w:hAnsi="Arial" w:cs="Arial"/>
-          <w:b/>
-          <w:bCs/>
-          <w:sz w:val="36"/>
-          <w:szCs w:val="36"/>
-          <w:lang w:eastAsia="en-GB"/>
-          <w14:ligatures w14:val="none"/>
-        </w:rPr>
-      </w:pPr>
-      <w:r>
-        <w:rPr>
-          <w:rFonts w:ascii="Arial" w:eastAsia="Times New Roman" w:hAnsi="Arial" w:cs="Arial"/>
-          <w:b/>
-          <w:bCs/>
-          <w:sz w:val="36"/>
-          <w:szCs w:val="36"/>
-          <w:lang w:eastAsia="en-GB"/>
-          <w14:ligatures w14:val="none"/>
-        </w:rPr>
-        <w:t>Long Description (Problem &amp; Solution Statement)</w:t>
-      </w:r>
-    </w:p>
-    <w:p>
-      <w:pPr>
-        <w:spacing w:after="100" w:afterAutospacing="1" w:line="240" w:lineRule="auto"/>
-        <w:rPr>
-          <w:rFonts w:ascii="Arial" w:eastAsia="Times New Roman" w:hAnsi="Arial" w:cs="Arial"/>
-          <w:sz w:val="24"/>
-          <w:szCs w:val="24"/>
-          <w:lang w:eastAsia="en-GB"/>
-          <w14:ligatures w14:val="none"/>
-        </w:rPr>
-      </w:pPr>
-      <w:r>
-        <w:rPr>
-          <w:rFonts w:ascii="Arial" w:eastAsia="Times New Roman" w:hAnsi="Arial" w:cs="Arial"/>
-          <w:b/>
-          <w:bCs/>
-          <w:sz w:val="24"/>
-          <w:szCs w:val="24"/>
-          <w:lang w:eastAsia="en-GB"/>
-          <w14:ligatures w14:val="none"/>
-        </w:rPr>
-        <w:t>The Problem</w:t>
-      </w:r>
-      <w:r>
-        <w:rPr>
-          <w:rFonts w:ascii="Arial" w:eastAsia="Times New Roman" w:hAnsi="Arial" w:cs="Arial"/>
-          <w:sz w:val="24"/>
-          <w:szCs w:val="24"/>
-          <w:lang w:eastAsia="en-GB"/>
-          <w14:ligatures w14:val="none"/>
-        </w:rPr>
-        <w:t xml:space="preserve"> The software engineering industry operates on the flawed assumption of infinite human capacity. Severe fatigue and human biological interruptions are massive disruptors to developer workflows. When a developer is fighting off an illness or is severely exhausted, cognitive function drops: code review quality plummets, syntax errors compound, and critical deployments are put at risk. Current market solutions only warn users about physical vulnerability, leaving developers to manage their complex workloads entirely on their own. </w:t>
-      </w:r>
-    </w:p>
-    <w:p>
-      <w:pPr>
-        <w:spacing w:after="100" w:afterAutospacing="1" w:line="240" w:lineRule="auto"/>
-        <w:rPr>
-          <w:rFonts w:ascii="Arial" w:eastAsia="Times New Roman" w:hAnsi="Arial" w:cs="Arial"/>
-          <w:sz w:val="24"/>
-          <w:szCs w:val="24"/>
-          <w:lang w:eastAsia="en-GB"/>
-          <w14:ligatures w14:val="none"/>
-        </w:rPr>
-      </w:pPr>
-      <w:r>
-        <w:rPr>
-          <w:rFonts w:ascii="Arial" w:eastAsia="Times New Roman" w:hAnsi="Arial" w:cs="Arial"/>
-          <w:b/>
-          <w:bCs/>
-          <w:sz w:val="24"/>
-          <w:szCs w:val="24"/>
-          <w:lang w:eastAsia="en-GB"/>
-          <w14:ligatures w14:val="none"/>
-        </w:rPr>
-        <w:t>The Solution</w:t>
-      </w:r>
-      <w:r>
-        <w:rPr>
-          <w:rFonts w:ascii="Arial" w:eastAsia="Times New Roman" w:hAnsi="Arial" w:cs="Arial"/>
-          <w:sz w:val="24"/>
-          <w:szCs w:val="24"/>
-          <w:lang w:eastAsia="en-GB"/>
-          <w14:ligatures w14:val="none"/>
-        </w:rPr>
-        <w:t xml:space="preserve"> Po-Ko—derived from the ancient Greek word </w:t>
-      </w:r>
-      <w:proofErr w:type="spellStart"/>
-      <w:r>
-        <w:rPr>
-          <w:rFonts w:ascii="Arial" w:eastAsia="Times New Roman" w:hAnsi="Arial" w:cs="Arial"/>
-          <w:i/>
-          <w:iCs/>
-          <w:sz w:val="24"/>
-          <w:szCs w:val="24"/>
-          <w:lang w:eastAsia="en-GB"/>
-          <w14:ligatures w14:val="none"/>
-        </w:rPr>
-        <w:t>ptōchos</w:t>
-      </w:r>
-      <w:proofErr w:type="spellEnd"/>
-      <w:r>
-        <w:rPr>
-          <w:rFonts w:ascii="Arial" w:eastAsia="Times New Roman" w:hAnsi="Arial" w:cs="Arial"/>
-          <w:sz w:val="24"/>
-          <w:szCs w:val="24"/>
-          <w:lang w:eastAsia="en-GB"/>
-          <w14:ligatures w14:val="none"/>
-        </w:rPr>
-        <w:t xml:space="preserve">, symbolizing the strength in acknowledging our limitations and our daily need for support—is a proactive developer capacity framework. It functions as a daily caretaker, utilizing a dynamic Po-Ko Scoring Algorithm (1–10) that fuses internal biometric vulnerability (Garmin Overnight HRV, Sleep Score, and Stress) with external exposure data gathered via intelligent micro-surveys. </w:t>
-      </w:r>
-    </w:p>
-    <w:p>
-      <w:pPr>
-        <w:spacing w:after="100" w:afterAutospacing="1" w:line="240" w:lineRule="auto"/>
-        <w:rPr>
-          <w:rFonts w:ascii="Arial" w:eastAsia="Times New Roman" w:hAnsi="Arial" w:cs="Arial"/>
-          <w:sz w:val="24"/>
-          <w:szCs w:val="24"/>
-          <w:lang w:eastAsia="en-GB"/>
-          <w14:ligatures w14:val="none"/>
-        </w:rPr>
-      </w:pPr>
-      <w:r>
-        <w:rPr>
-          <w:rFonts w:ascii="Arial" w:eastAsia="Times New Roman" w:hAnsi="Arial" w:cs="Arial"/>
-          <w:b/>
-          <w:bCs/>
-          <w:sz w:val="24"/>
-          <w:szCs w:val="24"/>
-          <w:lang w:eastAsia="en-GB"/>
-          <w14:ligatures w14:val="none"/>
-        </w:rPr>
-        <w:t>Target Users &amp; Interaction</w:t>
-      </w:r>
-      <w:r>
-        <w:rPr>
-          <w:rFonts w:ascii="Arial" w:eastAsia="Times New Roman" w:hAnsi="Arial" w:cs="Arial"/>
-          <w:sz w:val="24"/>
-          <w:szCs w:val="24"/>
-          <w:lang w:eastAsia="en-GB"/>
-          <w14:ligatures w14:val="none"/>
-        </w:rPr>
-        <w:t xml:space="preserve"> Designed for software engineers, Po-Ko makes the </w:t>
-      </w:r>
-      <w:r>
-        <w:rPr>
-          <w:rFonts w:ascii="Arial" w:eastAsia="Times New Roman" w:hAnsi="Arial" w:cs="Arial"/>
-          <w:b/>
-          <w:bCs/>
-          <w:sz w:val="24"/>
-          <w:szCs w:val="24"/>
-          <w:lang w:eastAsia="en-GB"/>
-          <w14:ligatures w14:val="none"/>
-        </w:rPr>
-        <w:t>IBM Bob IDE its primary interaction surface</w:t>
-      </w:r>
-      <w:r>
-        <w:rPr>
-          <w:rFonts w:ascii="Arial" w:eastAsia="Times New Roman" w:hAnsi="Arial" w:cs="Arial"/>
-          <w:sz w:val="24"/>
-          <w:szCs w:val="24"/>
-          <w:lang w:eastAsia="en-GB"/>
-          <w14:ligatures w14:val="none"/>
-        </w:rPr>
-        <w:t xml:space="preserve">. Through a custom Model Context Protocol (MCP) server, developers can interact directly with IBM Bob in their chat window to check their real-time Po-Ko capacity score, log daily metrics, report lifestyle context (external factors), and receive time-specific contextual health advice (morning, midday, afternoon). A comprehensive Vite/React web dashboard serves as a secondary full-view screen, offering detailed score breakdowns, explainability tooltips, and a 30-day recovery trend chart. </w:t>
-      </w:r>
-    </w:p>
-    <w:p>
-      <w:pPr>
-        <w:spacing w:after="100" w:afterAutospacing="1" w:line="240" w:lineRule="auto"/>
-        <w:rPr>
-          <w:rFonts w:ascii="Arial" w:eastAsia="Times New Roman" w:hAnsi="Arial" w:cs="Arial"/>
-          <w:sz w:val="24"/>
-          <w:szCs w:val="24"/>
-          <w:lang w:eastAsia="en-GB"/>
-          <w14:ligatures w14:val="none"/>
-        </w:rPr>
-      </w:pPr>
-      <w:r>
-        <w:rPr>
-          <w:rFonts w:ascii="Arial" w:eastAsia="Times New Roman" w:hAnsi="Arial" w:cs="Arial"/>
-          <w:b/>
-          <w:bCs/>
-          <w:sz w:val="24"/>
-          <w:szCs w:val="24"/>
-          <w:lang w:eastAsia="en-GB"/>
-          <w14:ligatures w14:val="none"/>
-        </w:rPr>
-        <w:t>Why It Is Creative &amp; Unique</w:t>
-      </w:r>
-    </w:p>
-    <w:p>
-      <w:pPr>
-        <w:spacing w:after="100" w:afterAutospacing="1" w:line="240" w:lineRule="auto"/>
-        <w:rPr>
-          <w:rFonts w:ascii="Arial" w:eastAsia="Times New Roman" w:hAnsi="Arial" w:cs="Arial"/>
-          <w:sz w:val="24"/>
-          <w:szCs w:val="24"/>
-          <w:lang w:eastAsia="en-GB"/>
-          <w14:ligatures w14:val="none"/>
-        </w:rPr>
-      </w:pPr>
-      <w:r>
-        <w:rPr>
-          <w:rFonts w:ascii="Arial" w:eastAsia="Times New Roman" w:hAnsi="Arial" w:cs="Arial"/>
-          <w:sz w:val="24"/>
-          <w:szCs w:val="24"/>
-          <w:lang w:eastAsia="en-GB"/>
-          <w14:ligatures w14:val="none"/>
-        </w:rPr>
-        <w:t>Po-Ko addresses developer burnout in entirely new ways:</w:t>
-      </w:r>
-    </w:p>
-    <w:p>
-      <w:pPr>
-        <w:numPr>
-          <w:ilvl w:val="0"/>
-          <w:numId w:val="1"/>
-        </w:numPr>
-        <w:spacing w:after="100" w:afterAutospacing="1" w:line="240" w:lineRule="auto"/>
-        <w:rPr>
-          <w:rFonts w:ascii="Arial" w:eastAsia="Times New Roman" w:hAnsi="Arial" w:cs="Arial"/>
-          <w:sz w:val="24"/>
-          <w:szCs w:val="24"/>
-          <w:lang w:eastAsia="en-GB"/>
-          <w14:ligatures w14:val="none"/>
-        </w:rPr>
-      </w:pPr>
-      <w:r>
-        <w:rPr>
-          <w:rFonts w:ascii="Arial" w:eastAsia="Times New Roman" w:hAnsi="Arial" w:cs="Arial"/>
-          <w:b/>
-          <w:bCs/>
-          <w:sz w:val="24"/>
-          <w:szCs w:val="24"/>
-          <w:lang w:eastAsia="en-GB"/>
-          <w14:ligatures w14:val="none"/>
-        </w:rPr>
-        <w:lastRenderedPageBreak/>
-        <w:t>100% Local-First Privacy:</w:t>
-      </w:r>
-      <w:r>
-        <w:rPr>
-          <w:rFonts w:ascii="Arial" w:eastAsia="Times New Roman" w:hAnsi="Arial" w:cs="Arial"/>
-          <w:sz w:val="24"/>
-          <w:szCs w:val="24"/>
-          <w:lang w:eastAsia="en-GB"/>
-          <w14:ligatures w14:val="none"/>
-        </w:rPr>
-        <w:t xml:space="preserve"> All telemetry is stored in a local SQLite database, ensuring zero biometric data leakage. </w:t>
-      </w:r>
-    </w:p>
-    <w:p>
-      <w:pPr>
-        <w:numPr>
-          <w:ilvl w:val="0"/>
-          <w:numId w:val="1"/>
-        </w:numPr>
-        <w:spacing w:after="100" w:afterAutospacing="1" w:line="240" w:lineRule="auto"/>
-        <w:rPr>
-          <w:rFonts w:ascii="Arial" w:eastAsia="Times New Roman" w:hAnsi="Arial" w:cs="Arial"/>
-          <w:sz w:val="24"/>
-          <w:szCs w:val="24"/>
-          <w:lang w:eastAsia="en-GB"/>
-          <w14:ligatures w14:val="none"/>
-        </w:rPr>
-      </w:pPr>
-      <w:r>
-        <w:rPr>
-          <w:rFonts w:ascii="Arial" w:eastAsia="Times New Roman" w:hAnsi="Arial" w:cs="Arial"/>
-          <w:b/>
-          <w:bCs/>
-          <w:sz w:val="24"/>
-          <w:szCs w:val="24"/>
-          <w:lang w:eastAsia="en-GB"/>
-          <w14:ligatures w14:val="none"/>
-        </w:rPr>
-        <w:t>Continuous Learning Engine:</w:t>
-      </w:r>
-      <w:r>
-        <w:rPr>
-          <w:rFonts w:ascii="Arial" w:eastAsia="Times New Roman" w:hAnsi="Arial" w:cs="Arial"/>
-          <w:sz w:val="24"/>
-          <w:szCs w:val="24"/>
-          <w:lang w:eastAsia="en-GB"/>
-          <w14:ligatures w14:val="none"/>
-        </w:rPr>
-        <w:t xml:space="preserve"> The system scans entire biometric histories to detect recurring, multi-day signatures that precede logged sick days, automatically generating new detection rules and pattern warnings tailored to the individual. </w:t>
-      </w:r>
-    </w:p>
-    <w:p>
-      <w:pPr>
-        <w:numPr>
-          <w:ilvl w:val="0"/>
-          <w:numId w:val="1"/>
-        </w:numPr>
-        <w:spacing w:after="100" w:afterAutospacing="1" w:line="240" w:lineRule="auto"/>
-        <w:rPr>
-          <w:rFonts w:ascii="Arial" w:eastAsia="Times New Roman" w:hAnsi="Arial" w:cs="Arial"/>
-          <w:sz w:val="24"/>
-          <w:szCs w:val="24"/>
-          <w:lang w:eastAsia="en-GB"/>
-          <w14:ligatures w14:val="none"/>
-        </w:rPr>
-      </w:pPr>
-      <w:r>
-        <w:rPr>
-          <w:rFonts w:ascii="Arial" w:eastAsia="Times New Roman" w:hAnsi="Arial" w:cs="Arial"/>
-          <w:b/>
-          <w:bCs/>
-          <w:sz w:val="24"/>
-          <w:szCs w:val="24"/>
-          <w:lang w:eastAsia="en-GB"/>
-          <w14:ligatures w14:val="none"/>
-        </w:rPr>
-        <w:t>Predictive Shielding:</w:t>
-      </w:r>
-      <w:r>
-        <w:rPr>
-          <w:rFonts w:ascii="Arial" w:eastAsia="Times New Roman" w:hAnsi="Arial" w:cs="Arial"/>
-          <w:sz w:val="24"/>
-          <w:szCs w:val="24"/>
-          <w:lang w:eastAsia="en-GB"/>
-          <w14:ligatures w14:val="none"/>
-        </w:rPr>
-        <w:t xml:space="preserve"> Features like the "72-Hour Rebound Rule" detect impending illness before symptoms arise. If a developer is in an "Active Support State," the "Code Guardian" classifies the cognitive weight of their Pull Requests and attaches traceability flags to high-risk code pushes to aid in future bug hunts. </w:t>
-      </w:r>
-    </w:p>
-    <w:p>
-      <w:pPr>
-        <w:pStyle w:val="Heading1"/>
-      </w:pPr>
-      <w:r>
-        <w:t>IBM Bob Usage Statement</w:t>
-      </w:r>
-    </w:p>
-    <w:p>
-      <w:pPr>
-        <w:pStyle w:val="NormalWeb"/>
-        <w:rPr>
-          <w:rFonts w:ascii="Arial" w:hAnsi="Arial" w:cs="Arial"/>
-        </w:rPr>
-      </w:pPr>
-      <w:r>
-        <w:rPr>
-          <w:rFonts w:ascii="Arial" w:hAnsi="Arial" w:cs="Arial"/>
           <w:b/>
           <w:bCs/>
         </w:rPr>
-        <w:t>How IBM Bob 2.0 Powered Po-Ko</w:t>
-      </w:r>
+        <w:t>100% Local-First Privacy:</w:t>
+      </w:r>
+      <w:r>
+        <w:t xml:space="preserve"> All telemetry is stored in a local SQLite database, ensuring zero biometric data leakage. </w:t>
+      </w:r>
+    </w:p>
+    <w:p>
       <w:r>
         <w:rPr>
-          <w:rFonts w:ascii="Arial" w:hAnsi="Arial" w:cs="Arial"/>
-        </w:rPr>
-        <w:t xml:space="preserve"> Operating under the strict 40-Bobcoin limit, we deployed IBM Bob IDE exclusively as our high-level software architect and active reasoning layer. We utilized Bob 2.0’s core capabilities to build the complex components of our predictive framework, generating the logic against our sanitized, 191-day local dataset.</w:t>
-      </w:r>
-    </w:p>
-    <w:p>
-      <w:pPr>
-        <w:pStyle w:val="NormalWeb"/>
-        <w:numPr>
-          <w:ilvl w:val="0"/>
-          <w:numId w:val="2"/>
-        </w:numPr>
-        <w:rPr>
-          <w:rFonts w:ascii="Arial" w:hAnsi="Arial" w:cs="Arial"/>
-        </w:rPr>
-      </w:pPr>
-      <w:r>
-        <w:rPr>
-          <w:rFonts w:ascii="Arial" w:hAnsi="Arial" w:cs="Arial"/>
           <w:b/>
           <w:bCs/>
         </w:rPr>
-        <w:t>Agent Mode &amp; Continuous Learning (The Telemetry Subagent):</w:t>
-      </w:r>
+        <w:t>Continuous Learning Engine:</w:t>
+      </w:r>
+      <w:r>
+        <w:t xml:space="preserve"> The system scans entire biometric histories to detect recurring, multi-day signatures that precede logged sick days, automatically generating new detection rules and pattern warnings tailored to the individual. </w:t>
+      </w:r>
+    </w:p>
+    <w:p>
       <w:r>
         <w:rPr>
-          <w:rFonts w:ascii="Arial" w:hAnsi="Arial" w:cs="Arial"/>
+          <w:b/>
+          <w:bCs/>
         </w:rPr>
-        <w:t xml:space="preserve"> We used Bob IDE to architect the local predictive engine (</w:t>
+        <w:t>Predictive Shielding:</w:t>
+      </w:r>
+      <w:r>
+        <w:t xml:space="preserve"> Features like the "72-Hour Rebound Rule" detect impending illness before symptoms arise. If a developer is in an "Active Support State," the "Code Guardian" classifies the cognitive weight of their Pull Requests and attaches traceability flags to high-risk code pushes to aid in future bug hunts. </w:t>
+      </w:r>
+    </w:p>
+    <w:p>
+      <w:pPr>
+        <w:pStyle w:val="Heading1"/>
+      </w:pPr>
+      <w:r>
+        <w:lastRenderedPageBreak/>
+        <w:t>IBM Bob Usage Statement</w:t>
+      </w:r>
+    </w:p>
+    <w:p>
+      <w:r>
+        <w:t>How IBM Bob 2.0 Powered Po-Ko Operating under the strict 40-Bobcoin limit, we deployed IBM Bob IDE exclusively as our high-level software architect and active reasoning layer. We utilized Bob 2.0’s core capabilities to build the complex components of our predictive framework, generating the logic against our sanitized, 191-day local dataset.</w:t>
+      </w:r>
+    </w:p>
+    <w:p>
+      <w:r>
+        <w:rPr>
+          <w:b/>
+          <w:bCs/>
+        </w:rPr>
+        <w:t>Agent Mode &amp; Continuous Learning</w:t>
+      </w:r>
+      <w:r>
+        <w:t xml:space="preserve"> (The Telemetry Subagent): We used Bob IDE to architect the local predictive engine (</w:t>
       </w:r>
       <w:r>
         <w:rPr>
           <w:rStyle w:val="HTMLCode"/>
-          <w:rFonts w:ascii="Arial" w:hAnsi="Arial" w:cs="Arial"/>
+          <w:rFonts w:ascii="Arial" w:eastAsiaTheme="minorHAnsi" w:hAnsi="Arial" w:cs="Arial"/>
+          <w:sz w:val="22"/>
+          <w:szCs w:val="22"/>
         </w:rPr>
         <w:t>pokoScoring.js</w:t>
       </w:r>
       <w:r>
-        <w:rPr>
-          <w:rFonts w:ascii="Arial" w:hAnsi="Arial" w:cs="Arial"/>
-        </w:rPr>
         <w:t xml:space="preserve">) and the dynamic </w:t>
       </w:r>
       <w:r>
         <w:rPr>
           <w:rStyle w:val="HTMLCode"/>
-          <w:rFonts w:ascii="Arial" w:hAnsi="Arial" w:cs="Arial"/>
+          <w:rFonts w:ascii="Arial" w:eastAsiaTheme="minorHAnsi" w:hAnsi="Arial" w:cs="Arial"/>
+          <w:sz w:val="22"/>
+          <w:szCs w:val="22"/>
         </w:rPr>
         <w:t>learningEngine.js</w:t>
       </w:r>
       <w:r>
+        <w:t xml:space="preserve">. Crucially, Bob helped us implement the continuous learning loop by scripting MCP client calls that allow the framework to autonomously </w:t>
+      </w:r>
+      <w:proofErr w:type="spellStart"/>
+      <w:r>
+        <w:t>analyze</w:t>
+      </w:r>
+      <w:proofErr w:type="spellEnd"/>
+      <w:r>
+        <w:t xml:space="preserve"> historical biometric patterns, generate personalized threshold rules, and write custom detection algorithms.</w:t>
+      </w:r>
+    </w:p>
+    <w:p>
+      <w:r>
         <w:rPr>
-          <w:rFonts w:ascii="Arial" w:hAnsi="Arial" w:cs="Arial"/>
-        </w:rPr>
-        <w:t xml:space="preserve">. Crucially, Bob helped us implement the continuous learning loop by scripting MCP client calls that allow the framework to autonomously </w:t>
-      </w:r>
-      <w:proofErr w:type="spellStart"/>
-      <w:r>
-        <w:rPr>
-          <w:rFonts w:ascii="Arial" w:hAnsi="Arial" w:cs="Arial"/>
-        </w:rPr>
-        <w:t>analyze</w:t>
-      </w:r>
-      <w:proofErr w:type="spellEnd"/>
-      <w:r>
-        <w:rPr>
-          <w:rFonts w:ascii="Arial" w:hAnsi="Arial" w:cs="Arial"/>
-        </w:rPr>
-        <w:t xml:space="preserve"> historical biometric patterns, generate personalized threshold rules, and write custom detection algorithms.</w:t>
-      </w:r>
-    </w:p>
-    <w:p>
-      <w:pPr>
-        <w:pStyle w:val="NormalWeb"/>
-        <w:numPr>
-          <w:ilvl w:val="0"/>
-          <w:numId w:val="2"/>
-        </w:numPr>
-        <w:rPr>
-          <w:rFonts w:ascii="Arial" w:hAnsi="Arial" w:cs="Arial"/>
-        </w:rPr>
-      </w:pPr>
-      <w:r>
-        <w:rPr>
-          <w:rFonts w:ascii="Arial" w:hAnsi="Arial" w:cs="Arial"/>
           <w:b/>
           <w:bCs/>
         </w:rPr>
         <w:t>Model Context Protocol (MCP) Architecture:</w:t>
       </w:r>
       <w:r>
-        <w:rPr>
-          <w:rFonts w:ascii="Arial" w:hAnsi="Arial" w:cs="Arial"/>
-        </w:rPr>
         <w:t xml:space="preserve"> To create seamless IDE interventions, Bob built our local MCP server (</w:t>
       </w:r>
       <w:r>
         <w:rPr>
           <w:rStyle w:val="HTMLCode"/>
-          <w:rFonts w:ascii="Arial" w:hAnsi="Arial" w:cs="Arial"/>
+          <w:rFonts w:ascii="Arial" w:eastAsiaTheme="minorHAnsi" w:hAnsi="Arial" w:cs="Arial"/>
+          <w:sz w:val="22"/>
+          <w:szCs w:val="22"/>
         </w:rPr>
         <w:t>server/mcp.js</w:t>
       </w:r>
       <w:r>
-        <w:rPr>
-          <w:rFonts w:ascii="Arial" w:hAnsi="Arial" w:cs="Arial"/>
-        </w:rPr>
         <w:t xml:space="preserve">) from the ground up. This included establishing the </w:t>
       </w:r>
       <w:proofErr w:type="spellStart"/>
       <w:r>
         <w:rPr>
           <w:rStyle w:val="HTMLCode"/>
-          <w:rFonts w:ascii="Arial" w:hAnsi="Arial" w:cs="Arial"/>
+          <w:rFonts w:ascii="Arial" w:eastAsiaTheme="minorHAnsi" w:hAnsi="Arial" w:cs="Arial"/>
+          <w:sz w:val="22"/>
+          <w:szCs w:val="22"/>
         </w:rPr>
         <w:t>stdio</w:t>
       </w:r>
       <w:proofErr w:type="spellEnd"/>
       <w:r>
-        <w:rPr>
-          <w:rFonts w:ascii="Arial" w:hAnsi="Arial" w:cs="Arial"/>
-        </w:rPr>
         <w:t xml:space="preserve"> transport layer and registering custom tools (</w:t>
       </w:r>
       <w:proofErr w:type="spellStart"/>
       <w:r>
         <w:rPr>
           <w:rStyle w:val="HTMLCode"/>
-          <w:rFonts w:ascii="Arial" w:hAnsi="Arial" w:cs="Arial"/>
+          <w:rFonts w:ascii="Arial" w:eastAsiaTheme="minorHAnsi" w:hAnsi="Arial" w:cs="Arial"/>
+          <w:sz w:val="22"/>
+          <w:szCs w:val="22"/>
         </w:rPr>
         <w:t>get_poko_status</w:t>
       </w:r>
       <w:proofErr w:type="spellEnd"/>
       <w:r>
-        <w:rPr>
-          <w:rFonts w:ascii="Arial" w:hAnsi="Arial" w:cs="Arial"/>
-        </w:rPr>
         <w:t xml:space="preserve">, </w:t>
       </w:r>
       <w:proofErr w:type="spellStart"/>
       <w:r>
         <w:rPr>
           <w:rStyle w:val="HTMLCode"/>
-          <w:rFonts w:ascii="Arial" w:hAnsi="Arial" w:cs="Arial"/>
+          <w:rFonts w:ascii="Arial" w:eastAsiaTheme="minorHAnsi" w:hAnsi="Arial" w:cs="Arial"/>
+          <w:sz w:val="22"/>
+          <w:szCs w:val="22"/>
         </w:rPr>
         <w:t>submit_survey</w:t>
       </w:r>
       <w:proofErr w:type="spellEnd"/>
       <w:r>
-        <w:rPr>
-          <w:rFonts w:ascii="Arial" w:hAnsi="Arial" w:cs="Arial"/>
-        </w:rPr>
         <w:t xml:space="preserve">, </w:t>
       </w:r>
       <w:proofErr w:type="spellStart"/>
       <w:r>
         <w:rPr>
           <w:rStyle w:val="HTMLCode"/>
-          <w:rFonts w:ascii="Arial" w:hAnsi="Arial" w:cs="Arial"/>
+          <w:rFonts w:ascii="Arial" w:eastAsiaTheme="minorHAnsi" w:hAnsi="Arial" w:cs="Arial"/>
+          <w:sz w:val="22"/>
+          <w:szCs w:val="22"/>
         </w:rPr>
         <w:t>get_advice</w:t>
       </w:r>
       <w:proofErr w:type="spellEnd"/>
       <w:r>
+        <w:t>) that wire the Po-Ko framework directly into the IBM Bob IDE workflow.</w:t>
+      </w:r>
+    </w:p>
+    <w:p>
+      <w:r>
         <w:rPr>
-          <w:rFonts w:ascii="Arial" w:hAnsi="Arial" w:cs="Arial"/>
-        </w:rPr>
-        <w:t>) that wire the Po-Ko framework directly into the IBM Bob IDE workflow.</w:t>
-      </w:r>
-    </w:p>
-    <w:p>
-      <w:pPr>
-        <w:pStyle w:val="NormalWeb"/>
-        <w:numPr>
-          <w:ilvl w:val="0"/>
-          <w:numId w:val="2"/>
-        </w:numPr>
-        <w:rPr>
-          <w:rFonts w:ascii="Arial" w:hAnsi="Arial" w:cs="Arial"/>
-        </w:rPr>
-      </w:pPr>
-      <w:r>
-        <w:rPr>
-          <w:rFonts w:ascii="Arial" w:hAnsi="Arial" w:cs="Arial"/>
           <w:b/>
           <w:bCs/>
         </w:rPr>
         <w:t>Document Understanding (The Context Subagent):</w:t>
       </w:r>
       <w:r>
+        <w:t xml:space="preserve"> We leveraged Bob 2.0’s Document Understanding to build our "Code Guardian" feature. Bob wrote the script that scans GitHub PR descriptions and codebase structures to classify upcoming tasks by cognitive weight, intelligently fusing biometric data with self-reported micro-surveys. If the score triggers an "Active Support State," Bob’s logic applies a metadata flag to the pushed code for future bug traceability.</w:t>
+      </w:r>
+    </w:p>
+    <w:p>
+      <w:r>
         <w:rPr>
-          <w:rFonts w:ascii="Arial" w:hAnsi="Arial" w:cs="Arial"/>
-        </w:rPr>
-        <w:t xml:space="preserve"> We leveraged Bob 2.0’s Document Understanding to build our "Code Guardian" feature. Bob wrote the script that scans GitHub PR descriptions and codebase structures to classify upcoming tasks by cognitive weight, intelligently fusing biometric data with self-reported micro-surveys. If the score triggers an "Active Support State," Bob’s logic applies a metadata flag to the pushed code for future bug traceability.</w:t>
-      </w:r>
-    </w:p>
-    <w:p>
-      <w:pPr>
-        <w:pStyle w:val="NormalWeb"/>
-        <w:numPr>
-          <w:ilvl w:val="0"/>
-          <w:numId w:val="2"/>
-        </w:numPr>
-        <w:rPr>
-          <w:rFonts w:ascii="Arial" w:hAnsi="Arial" w:cs="Arial"/>
-        </w:rPr>
-      </w:pPr>
-      <w:r>
-        <w:rPr>
-          <w:rFonts w:ascii="Arial" w:hAnsi="Arial" w:cs="Arial"/>
           <w:b/>
           <w:bCs/>
         </w:rPr>
-        <w:t>Rapid Prototyping &amp; Integration Stabilization:</w:t>
-      </w:r>
-      <w:r>
-        <w:rPr>
-          <w:rFonts w:ascii="Arial" w:hAnsi="Arial" w:cs="Arial"/>
-        </w:rPr>
-        <w:t xml:space="preserve"> Beyond the core architecture, Bob was utilized to accelerate full-stack refinement. This included aligning the Vite/React dashboard UI with the IBM Bob IDE design language, managing local SQLite database migrations for persistent telemetry, and executing surgical debugging across the Express routing and client layers to ensure a stable, production-ready prototype.</w:t>
-      </w:r>
-    </w:p>
-    <w:p>
-      <w:pPr>
-        <w:spacing w:after="100" w:afterAutospacing="1" w:line="240" w:lineRule="auto"/>
-        <w:outlineLvl w:val="1"/>
-        <w:rPr>
-          <w:rFonts w:ascii="Arial" w:hAnsi="Arial" w:cs="Arial"/>
-        </w:rPr>
-      </w:pPr>
-    </w:p>
+        <w:t>Rapid Prototyping &amp; Integration Stabilization</w:t>
+      </w:r>
+      <w:r>
+        <w:t>: Beyond the core architecture, Bob was utilized to accelerate full-stack refinement. This included aligning the Vite/React dashboard UI with the IBM Bob IDE design language, managing local SQLite database migrations for persistent telemetry, and executing surgical debugging across the Express routing and client layers to ensure a stable, production-ready prototype.</w:t>
+      </w:r>
+    </w:p>
+    <w:p/>
     <w:sectPr>
       <w:pgSz w:w="11906" w:h="16838"/>
       <w:pgMar w:top="1440" w:right="1440" w:bottom="1440" w:left="1440" w:header="708" w:footer="708" w:gutter="0"/>
@@ -1461,9 +1014,10 @@
   <w:style w:type="paragraph" w:default="1" w:styleId="Normal">
     <w:name w:val="Normal"/>
     <w:qFormat/>
-    <w:rsid w:val="002C572B"/>
-    <w:rPr>
-      <w:rFonts w:ascii="Times New Roman" w:hAnsi="Times New Roman" w:cs="Times New Roman"/>
+    <w:rsid w:val="00E40B7A"/>
+    <w:rPr>
+      <w:rFonts w:ascii="Arial" w:hAnsi="Arial" w:cs="Arial"/>
+      <w:lang w:eastAsia="en-GB"/>
     </w:rPr>
   </w:style>
   <w:style w:type="paragraph" w:styleId="Heading1">
@@ -1473,7 +1027,7 @@
     <w:link w:val="Heading1Char"/>
     <w:uiPriority w:val="9"/>
     <w:qFormat/>
-    <w:rsid w:val="002C572B"/>
+    <w:rsid w:val="00E40B7A"/>
     <w:pPr>
       <w:outlineLvl w:val="0"/>
     </w:pPr>
@@ -1690,13 +1244,14 @@
     <w:basedOn w:val="DefaultParagraphFont"/>
     <w:link w:val="Heading1"/>
     <w:uiPriority w:val="9"/>
-    <w:rsid w:val="002C572B"/>
-    <w:rPr>
-      <w:rFonts w:ascii="Times New Roman" w:hAnsi="Times New Roman" w:cs="Times New Roman"/>
+    <w:rsid w:val="00E40B7A"/>
+    <w:rPr>
+      <w:rFonts w:ascii="Arial" w:hAnsi="Arial" w:cs="Arial"/>
       <w:b/>
       <w:bCs/>
       <w:sz w:val="24"/>
       <w:szCs w:val="24"/>
+      <w:lang w:eastAsia="en-GB"/>
     </w:rPr>
   </w:style>
   <w:style w:type="character" w:customStyle="1" w:styleId="Heading2Char">
@@ -1990,7 +1545,6 @@
       <w:rFonts w:eastAsia="Times New Roman"/>
       <w:sz w:val="24"/>
       <w:szCs w:val="24"/>
-      <w:lang w:eastAsia="en-GB"/>
       <w14:ligatures w14:val="none"/>
     </w:rPr>
   </w:style>

</xml_diff>